<commit_message>
Ajout de psr et son test bench + Reg aff et son test bench du datapaht + rapport presque finie
</commit_message>
<xml_diff>
--- a/Rapport/Rapport_FPGA_S6.docx
+++ b/Rapport/Rapport_FPGA_S6.docx
@@ -250,7 +250,7 @@
           <w:r>
             <w:fldChar w:fldCharType="separate"/>
           </w:r>
-          <w:hyperlink w:anchor="_Toc232347023" w:history="1">
+          <w:hyperlink w:anchor="_Toc232353162" w:history="1">
             <w:r>
               <w:rPr>
                 <w:rStyle w:val="Lienhypertexte"/>
@@ -277,7 +277,7 @@
                 <w:noProof/>
                 <w:webHidden/>
               </w:rPr>
-              <w:instrText xml:space="preserve"> PAGEREF _Toc232347023 \h </w:instrText>
+              <w:instrText xml:space="preserve"> PAGEREF _Toc232353162 \h </w:instrText>
             </w:r>
             <w:r>
               <w:rPr>
@@ -320,7 +320,7 @@
               <w:sz w:val="24"/>
             </w:rPr>
           </w:pPr>
-          <w:hyperlink w:anchor="_Toc232347024" w:history="1">
+          <w:hyperlink w:anchor="_Toc232353163" w:history="1">
             <w:r>
               <w:rPr>
                 <w:rStyle w:val="Lienhypertexte"/>
@@ -347,7 +347,7 @@
                 <w:noProof/>
                 <w:webHidden/>
               </w:rPr>
-              <w:instrText xml:space="preserve"> PAGEREF _Toc232347024 \h </w:instrText>
+              <w:instrText xml:space="preserve"> PAGEREF _Toc232353163 \h </w:instrText>
             </w:r>
             <w:r>
               <w:rPr>
@@ -391,7 +391,7 @@
               <w:sz w:val="24"/>
             </w:rPr>
           </w:pPr>
-          <w:hyperlink w:anchor="_Toc232347025" w:history="1">
+          <w:hyperlink w:anchor="_Toc232353164" w:history="1">
             <w:r>
               <w:rPr>
                 <w:rStyle w:val="Lienhypertexte"/>
@@ -433,7 +433,7 @@
                 <w:noProof/>
                 <w:webHidden/>
               </w:rPr>
-              <w:instrText xml:space="preserve"> PAGEREF _Toc232347025 \h </w:instrText>
+              <w:instrText xml:space="preserve"> PAGEREF _Toc232353164 \h </w:instrText>
             </w:r>
             <w:r>
               <w:rPr>
@@ -477,7 +477,7 @@
               <w:sz w:val="24"/>
             </w:rPr>
           </w:pPr>
-          <w:hyperlink w:anchor="_Toc232347026" w:history="1">
+          <w:hyperlink w:anchor="_Toc232353165" w:history="1">
             <w:r>
               <w:rPr>
                 <w:rStyle w:val="Lienhypertexte"/>
@@ -519,7 +519,7 @@
                 <w:noProof/>
                 <w:webHidden/>
               </w:rPr>
-              <w:instrText xml:space="preserve"> PAGEREF _Toc232347026 \h </w:instrText>
+              <w:instrText xml:space="preserve"> PAGEREF _Toc232353165 \h </w:instrText>
             </w:r>
             <w:r>
               <w:rPr>
@@ -563,7 +563,7 @@
               <w:sz w:val="24"/>
             </w:rPr>
           </w:pPr>
-          <w:hyperlink w:anchor="_Toc232347027" w:history="1">
+          <w:hyperlink w:anchor="_Toc232353166" w:history="1">
             <w:r>
               <w:rPr>
                 <w:rStyle w:val="Lienhypertexte"/>
@@ -605,7 +605,7 @@
                 <w:noProof/>
                 <w:webHidden/>
               </w:rPr>
-              <w:instrText xml:space="preserve"> PAGEREF _Toc232347027 \h </w:instrText>
+              <w:instrText xml:space="preserve"> PAGEREF _Toc232353166 \h </w:instrText>
             </w:r>
             <w:r>
               <w:rPr>
@@ -649,7 +649,7 @@
               <w:sz w:val="24"/>
             </w:rPr>
           </w:pPr>
-          <w:hyperlink w:anchor="_Toc232347028" w:history="1">
+          <w:hyperlink w:anchor="_Toc232353167" w:history="1">
             <w:r>
               <w:rPr>
                 <w:rStyle w:val="Lienhypertexte"/>
@@ -691,7 +691,7 @@
                 <w:noProof/>
                 <w:webHidden/>
               </w:rPr>
-              <w:instrText xml:space="preserve"> PAGEREF _Toc232347028 \h </w:instrText>
+              <w:instrText xml:space="preserve"> PAGEREF _Toc232353167 \h </w:instrText>
             </w:r>
             <w:r>
               <w:rPr>
@@ -735,7 +735,7 @@
               <w:sz w:val="24"/>
             </w:rPr>
           </w:pPr>
-          <w:hyperlink w:anchor="_Toc232347029" w:history="1">
+          <w:hyperlink w:anchor="_Toc232353168" w:history="1">
             <w:r>
               <w:rPr>
                 <w:rStyle w:val="Lienhypertexte"/>
@@ -777,7 +777,7 @@
                 <w:noProof/>
                 <w:webHidden/>
               </w:rPr>
-              <w:instrText xml:space="preserve"> PAGEREF _Toc232347029 \h </w:instrText>
+              <w:instrText xml:space="preserve"> PAGEREF _Toc232353168 \h </w:instrText>
             </w:r>
             <w:r>
               <w:rPr>
@@ -821,7 +821,7 @@
               <w:sz w:val="24"/>
             </w:rPr>
           </w:pPr>
-          <w:hyperlink w:anchor="_Toc232347030" w:history="1">
+          <w:hyperlink w:anchor="_Toc232353169" w:history="1">
             <w:r>
               <w:rPr>
                 <w:rStyle w:val="Lienhypertexte"/>
@@ -863,7 +863,7 @@
                 <w:noProof/>
                 <w:webHidden/>
               </w:rPr>
-              <w:instrText xml:space="preserve"> PAGEREF _Toc232347030 \h </w:instrText>
+              <w:instrText xml:space="preserve"> PAGEREF _Toc232353169 \h </w:instrText>
             </w:r>
             <w:r>
               <w:rPr>
@@ -907,7 +907,7 @@
               <w:sz w:val="24"/>
             </w:rPr>
           </w:pPr>
-          <w:hyperlink w:anchor="_Toc232347031" w:history="1">
+          <w:hyperlink w:anchor="_Toc232353170" w:history="1">
             <w:r>
               <w:rPr>
                 <w:rStyle w:val="Lienhypertexte"/>
@@ -949,7 +949,7 @@
                 <w:noProof/>
                 <w:webHidden/>
               </w:rPr>
-              <w:instrText xml:space="preserve"> PAGEREF _Toc232347031 \h </w:instrText>
+              <w:instrText xml:space="preserve"> PAGEREF _Toc232353170 \h </w:instrText>
             </w:r>
             <w:r>
               <w:rPr>
@@ -993,7 +993,7 @@
               <w:sz w:val="24"/>
             </w:rPr>
           </w:pPr>
-          <w:hyperlink w:anchor="_Toc232347032" w:history="1">
+          <w:hyperlink w:anchor="_Toc232353171" w:history="1">
             <w:r>
               <w:rPr>
                 <w:rStyle w:val="Lienhypertexte"/>
@@ -1035,7 +1035,7 @@
                 <w:noProof/>
                 <w:webHidden/>
               </w:rPr>
-              <w:instrText xml:space="preserve"> PAGEREF _Toc232347032 \h </w:instrText>
+              <w:instrText xml:space="preserve"> PAGEREF _Toc232353171 \h </w:instrText>
             </w:r>
             <w:r>
               <w:rPr>
@@ -1079,7 +1079,7 @@
               <w:sz w:val="24"/>
             </w:rPr>
           </w:pPr>
-          <w:hyperlink w:anchor="_Toc232347033" w:history="1">
+          <w:hyperlink w:anchor="_Toc232353172" w:history="1">
             <w:r>
               <w:rPr>
                 <w:rStyle w:val="Lienhypertexte"/>
@@ -1121,7 +1121,7 @@
                 <w:noProof/>
                 <w:webHidden/>
               </w:rPr>
-              <w:instrText xml:space="preserve"> PAGEREF _Toc232347033 \h </w:instrText>
+              <w:instrText xml:space="preserve"> PAGEREF _Toc232353172 \h </w:instrText>
             </w:r>
             <w:r>
               <w:rPr>
@@ -1165,7 +1165,7 @@
               <w:sz w:val="24"/>
             </w:rPr>
           </w:pPr>
-          <w:hyperlink w:anchor="_Toc232347034" w:history="1">
+          <w:hyperlink w:anchor="_Toc232353173" w:history="1">
             <w:r>
               <w:rPr>
                 <w:rStyle w:val="Lienhypertexte"/>
@@ -1207,7 +1207,7 @@
                 <w:noProof/>
                 <w:webHidden/>
               </w:rPr>
-              <w:instrText xml:space="preserve"> PAGEREF _Toc232347034 \h </w:instrText>
+              <w:instrText xml:space="preserve"> PAGEREF _Toc232353173 \h </w:instrText>
             </w:r>
             <w:r>
               <w:rPr>
@@ -1251,7 +1251,7 @@
               <w:sz w:val="24"/>
             </w:rPr>
           </w:pPr>
-          <w:hyperlink w:anchor="_Toc232347035" w:history="1">
+          <w:hyperlink w:anchor="_Toc232353174" w:history="1">
             <w:r>
               <w:rPr>
                 <w:rStyle w:val="Lienhypertexte"/>
@@ -1293,7 +1293,7 @@
                 <w:noProof/>
                 <w:webHidden/>
               </w:rPr>
-              <w:instrText xml:space="preserve"> PAGEREF _Toc232347035 \h </w:instrText>
+              <w:instrText xml:space="preserve"> PAGEREF _Toc232353174 \h </w:instrText>
             </w:r>
             <w:r>
               <w:rPr>
@@ -1337,7 +1337,7 @@
               <w:sz w:val="24"/>
             </w:rPr>
           </w:pPr>
-          <w:hyperlink w:anchor="_Toc232347036" w:history="1">
+          <w:hyperlink w:anchor="_Toc232353175" w:history="1">
             <w:r>
               <w:rPr>
                 <w:rStyle w:val="Lienhypertexte"/>
@@ -1379,7 +1379,7 @@
                 <w:noProof/>
                 <w:webHidden/>
               </w:rPr>
-              <w:instrText xml:space="preserve"> PAGEREF _Toc232347036 \h </w:instrText>
+              <w:instrText xml:space="preserve"> PAGEREF _Toc232353175 \h </w:instrText>
             </w:r>
             <w:r>
               <w:rPr>
@@ -1423,7 +1423,7 @@
               <w:sz w:val="24"/>
             </w:rPr>
           </w:pPr>
-          <w:hyperlink w:anchor="_Toc232347037" w:history="1">
+          <w:hyperlink w:anchor="_Toc232353176" w:history="1">
             <w:r>
               <w:rPr>
                 <w:rStyle w:val="Lienhypertexte"/>
@@ -1465,7 +1465,7 @@
                 <w:noProof/>
                 <w:webHidden/>
               </w:rPr>
-              <w:instrText xml:space="preserve"> PAGEREF _Toc232347037 \h </w:instrText>
+              <w:instrText xml:space="preserve"> PAGEREF _Toc232353176 \h </w:instrText>
             </w:r>
             <w:r>
               <w:rPr>
@@ -1509,7 +1509,7 @@
               <w:sz w:val="24"/>
             </w:rPr>
           </w:pPr>
-          <w:hyperlink w:anchor="_Toc232347038" w:history="1">
+          <w:hyperlink w:anchor="_Toc232353177" w:history="1">
             <w:r>
               <w:rPr>
                 <w:rStyle w:val="Lienhypertexte"/>
@@ -1551,7 +1551,7 @@
                 <w:noProof/>
                 <w:webHidden/>
               </w:rPr>
-              <w:instrText xml:space="preserve"> PAGEREF _Toc232347038 \h </w:instrText>
+              <w:instrText xml:space="preserve"> PAGEREF _Toc232353177 \h </w:instrText>
             </w:r>
             <w:r>
               <w:rPr>
@@ -1595,7 +1595,7 @@
               <w:sz w:val="24"/>
             </w:rPr>
           </w:pPr>
-          <w:hyperlink w:anchor="_Toc232347039" w:history="1">
+          <w:hyperlink w:anchor="_Toc232353178" w:history="1">
             <w:r>
               <w:rPr>
                 <w:rStyle w:val="Lienhypertexte"/>
@@ -1637,7 +1637,7 @@
                 <w:noProof/>
                 <w:webHidden/>
               </w:rPr>
-              <w:instrText xml:space="preserve"> PAGEREF _Toc232347039 \h </w:instrText>
+              <w:instrText xml:space="preserve"> PAGEREF _Toc232353178 \h </w:instrText>
             </w:r>
             <w:r>
               <w:rPr>
@@ -1681,7 +1681,7 @@
               <w:sz w:val="24"/>
             </w:rPr>
           </w:pPr>
-          <w:hyperlink w:anchor="_Toc232347040" w:history="1">
+          <w:hyperlink w:anchor="_Toc232353179" w:history="1">
             <w:r>
               <w:rPr>
                 <w:rStyle w:val="Lienhypertexte"/>
@@ -1723,7 +1723,7 @@
                 <w:noProof/>
                 <w:webHidden/>
               </w:rPr>
-              <w:instrText xml:space="preserve"> PAGEREF _Toc232347040 \h </w:instrText>
+              <w:instrText xml:space="preserve"> PAGEREF _Toc232353179 \h </w:instrText>
             </w:r>
             <w:r>
               <w:rPr>
@@ -1767,7 +1767,7 @@
               <w:sz w:val="24"/>
             </w:rPr>
           </w:pPr>
-          <w:hyperlink w:anchor="_Toc232347041" w:history="1">
+          <w:hyperlink w:anchor="_Toc232353180" w:history="1">
             <w:r>
               <w:rPr>
                 <w:rStyle w:val="Lienhypertexte"/>
@@ -1809,7 +1809,7 @@
                 <w:noProof/>
                 <w:webHidden/>
               </w:rPr>
-              <w:instrText xml:space="preserve"> PAGEREF _Toc232347041 \h </w:instrText>
+              <w:instrText xml:space="preserve"> PAGEREF _Toc232353180 \h </w:instrText>
             </w:r>
             <w:r>
               <w:rPr>
@@ -1853,7 +1853,7 @@
               <w:sz w:val="24"/>
             </w:rPr>
           </w:pPr>
-          <w:hyperlink w:anchor="_Toc232347042" w:history="1">
+          <w:hyperlink w:anchor="_Toc232353181" w:history="1">
             <w:r>
               <w:rPr>
                 <w:rStyle w:val="Lienhypertexte"/>
@@ -1895,7 +1895,7 @@
                 <w:noProof/>
                 <w:webHidden/>
               </w:rPr>
-              <w:instrText xml:space="preserve"> PAGEREF _Toc232347042 \h </w:instrText>
+              <w:instrText xml:space="preserve"> PAGEREF _Toc232353181 \h </w:instrText>
             </w:r>
             <w:r>
               <w:rPr>
@@ -1939,7 +1939,7 @@
               <w:sz w:val="24"/>
             </w:rPr>
           </w:pPr>
-          <w:hyperlink w:anchor="_Toc232347043" w:history="1">
+          <w:hyperlink w:anchor="_Toc232353182" w:history="1">
             <w:r>
               <w:rPr>
                 <w:rStyle w:val="Lienhypertexte"/>
@@ -1981,7 +1981,7 @@
                 <w:noProof/>
                 <w:webHidden/>
               </w:rPr>
-              <w:instrText xml:space="preserve"> PAGEREF _Toc232347043 \h </w:instrText>
+              <w:instrText xml:space="preserve"> PAGEREF _Toc232353182 \h </w:instrText>
             </w:r>
             <w:r>
               <w:rPr>
@@ -2025,7 +2025,7 @@
               <w:sz w:val="24"/>
             </w:rPr>
           </w:pPr>
-          <w:hyperlink w:anchor="_Toc232347044" w:history="1">
+          <w:hyperlink w:anchor="_Toc232353183" w:history="1">
             <w:r>
               <w:rPr>
                 <w:rStyle w:val="Lienhypertexte"/>
@@ -2067,7 +2067,7 @@
                 <w:noProof/>
                 <w:webHidden/>
               </w:rPr>
-              <w:instrText xml:space="preserve"> PAGEREF _Toc232347044 \h </w:instrText>
+              <w:instrText xml:space="preserve"> PAGEREF _Toc232353183 \h </w:instrText>
             </w:r>
             <w:r>
               <w:rPr>
@@ -2111,7 +2111,7 @@
               <w:sz w:val="24"/>
             </w:rPr>
           </w:pPr>
-          <w:hyperlink w:anchor="_Toc232347045" w:history="1">
+          <w:hyperlink w:anchor="_Toc232353184" w:history="1">
             <w:r>
               <w:rPr>
                 <w:rStyle w:val="Lienhypertexte"/>
@@ -2153,7 +2153,7 @@
                 <w:noProof/>
                 <w:webHidden/>
               </w:rPr>
-              <w:instrText xml:space="preserve"> PAGEREF _Toc232347045 \h </w:instrText>
+              <w:instrText xml:space="preserve"> PAGEREF _Toc232353184 \h </w:instrText>
             </w:r>
             <w:r>
               <w:rPr>
@@ -2197,7 +2197,7 @@
               <w:sz w:val="24"/>
             </w:rPr>
           </w:pPr>
-          <w:hyperlink w:anchor="_Toc232347046" w:history="1">
+          <w:hyperlink w:anchor="_Toc232353185" w:history="1">
             <w:r>
               <w:rPr>
                 <w:rStyle w:val="Lienhypertexte"/>
@@ -2239,7 +2239,7 @@
                 <w:noProof/>
                 <w:webHidden/>
               </w:rPr>
-              <w:instrText xml:space="preserve"> PAGEREF _Toc232347046 \h </w:instrText>
+              <w:instrText xml:space="preserve"> PAGEREF _Toc232353185 \h </w:instrText>
             </w:r>
             <w:r>
               <w:rPr>
@@ -2283,7 +2283,7 @@
               <w:sz w:val="24"/>
             </w:rPr>
           </w:pPr>
-          <w:hyperlink w:anchor="_Toc232347047" w:history="1">
+          <w:hyperlink w:anchor="_Toc232353186" w:history="1">
             <w:r>
               <w:rPr>
                 <w:rStyle w:val="Lienhypertexte"/>
@@ -2325,7 +2325,7 @@
                 <w:noProof/>
                 <w:webHidden/>
               </w:rPr>
-              <w:instrText xml:space="preserve"> PAGEREF _Toc232347047 \h </w:instrText>
+              <w:instrText xml:space="preserve"> PAGEREF _Toc232353186 \h </w:instrText>
             </w:r>
             <w:r>
               <w:rPr>
@@ -2369,7 +2369,7 @@
               <w:sz w:val="24"/>
             </w:rPr>
           </w:pPr>
-          <w:hyperlink w:anchor="_Toc232347048" w:history="1">
+          <w:hyperlink w:anchor="_Toc232353187" w:history="1">
             <w:r>
               <w:rPr>
                 <w:rStyle w:val="Lienhypertexte"/>
@@ -2411,7 +2411,7 @@
                 <w:noProof/>
                 <w:webHidden/>
               </w:rPr>
-              <w:instrText xml:space="preserve"> PAGEREF _Toc232347048 \h </w:instrText>
+              <w:instrText xml:space="preserve"> PAGEREF _Toc232353187 \h </w:instrText>
             </w:r>
             <w:r>
               <w:rPr>
@@ -2455,7 +2455,7 @@
               <w:sz w:val="24"/>
             </w:rPr>
           </w:pPr>
-          <w:hyperlink w:anchor="_Toc232347049" w:history="1">
+          <w:hyperlink w:anchor="_Toc232353188" w:history="1">
             <w:r>
               <w:rPr>
                 <w:rStyle w:val="Lienhypertexte"/>
@@ -2497,7 +2497,7 @@
                 <w:noProof/>
                 <w:webHidden/>
               </w:rPr>
-              <w:instrText xml:space="preserve"> PAGEREF _Toc232347049 \h </w:instrText>
+              <w:instrText xml:space="preserve"> PAGEREF _Toc232353188 \h </w:instrText>
             </w:r>
             <w:r>
               <w:rPr>
@@ -2541,7 +2541,7 @@
               <w:sz w:val="24"/>
             </w:rPr>
           </w:pPr>
-          <w:hyperlink w:anchor="_Toc232347050" w:history="1">
+          <w:hyperlink w:anchor="_Toc232353189" w:history="1">
             <w:r>
               <w:rPr>
                 <w:rStyle w:val="Lienhypertexte"/>
@@ -2562,6 +2562,92 @@
                 <w:rStyle w:val="Lienhypertexte"/>
                 <w:noProof/>
               </w:rPr>
+              <w:t>Registre de commande 32bits</w:t>
+            </w:r>
+            <w:r>
+              <w:rPr>
+                <w:noProof/>
+                <w:webHidden/>
+              </w:rPr>
+              <w:tab/>
+            </w:r>
+            <w:r>
+              <w:rPr>
+                <w:noProof/>
+                <w:webHidden/>
+              </w:rPr>
+              <w:fldChar w:fldCharType="begin"/>
+            </w:r>
+            <w:r>
+              <w:rPr>
+                <w:noProof/>
+                <w:webHidden/>
+              </w:rPr>
+              <w:instrText xml:space="preserve"> PAGEREF _Toc232353189 \h </w:instrText>
+            </w:r>
+            <w:r>
+              <w:rPr>
+                <w:noProof/>
+                <w:webHidden/>
+              </w:rPr>
+            </w:r>
+            <w:r>
+              <w:rPr>
+                <w:noProof/>
+                <w:webHidden/>
+              </w:rPr>
+              <w:fldChar w:fldCharType="separate"/>
+            </w:r>
+            <w:r>
+              <w:rPr>
+                <w:noProof/>
+                <w:webHidden/>
+              </w:rPr>
+              <w:t>22</w:t>
+            </w:r>
+            <w:r>
+              <w:rPr>
+                <w:noProof/>
+                <w:webHidden/>
+              </w:rPr>
+              <w:fldChar w:fldCharType="end"/>
+            </w:r>
+          </w:hyperlink>
+        </w:p>
+        <w:p>
+          <w:pPr>
+            <w:pStyle w:val="TM2"/>
+            <w:tabs>
+              <w:tab w:val="left" w:pos="960"/>
+              <w:tab w:val="right" w:leader="dot" w:pos="9062"/>
+            </w:tabs>
+            <w:rPr>
+              <w:rFonts w:asciiTheme="minorHAnsi" w:eastAsiaTheme="minorEastAsia" w:hAnsiTheme="minorHAnsi"/>
+              <w:noProof/>
+              <w:sz w:val="24"/>
+            </w:rPr>
+          </w:pPr>
+          <w:hyperlink w:anchor="_Toc232353190" w:history="1">
+            <w:r>
+              <w:rPr>
+                <w:rStyle w:val="Lienhypertexte"/>
+                <w:noProof/>
+              </w:rPr>
+              <w:t>H.</w:t>
+            </w:r>
+            <w:r>
+              <w:rPr>
+                <w:rFonts w:asciiTheme="minorHAnsi" w:eastAsiaTheme="minorEastAsia" w:hAnsiTheme="minorHAnsi"/>
+                <w:noProof/>
+                <w:sz w:val="24"/>
+              </w:rPr>
+              <w:tab/>
+            </w:r>
+            <w:r>
+              <w:rPr>
+                <w:rStyle w:val="Lienhypertexte"/>
+                <w:noProof/>
+              </w:rPr>
               <w:t>Unité de gestion d’instruction</w:t>
             </w:r>
             <w:r>
@@ -2583,7 +2669,7 @@
                 <w:noProof/>
                 <w:webHidden/>
               </w:rPr>
-              <w:instrText xml:space="preserve"> PAGEREF _Toc232347050 \h </w:instrText>
+              <w:instrText xml:space="preserve"> PAGEREF _Toc232353190 \h </w:instrText>
             </w:r>
             <w:r>
               <w:rPr>
@@ -2603,7 +2689,7 @@
                 <w:noProof/>
                 <w:webHidden/>
               </w:rPr>
-              <w:t>22</w:t>
+              <w:t>23</w:t>
             </w:r>
             <w:r>
               <w:rPr>
@@ -2627,7 +2713,7 @@
               <w:sz w:val="24"/>
             </w:rPr>
           </w:pPr>
-          <w:hyperlink w:anchor="_Toc232347051" w:history="1">
+          <w:hyperlink w:anchor="_Toc232353191" w:history="1">
             <w:r>
               <w:rPr>
                 <w:rStyle w:val="Lienhypertexte"/>
@@ -2669,7 +2755,7 @@
                 <w:noProof/>
                 <w:webHidden/>
               </w:rPr>
-              <w:instrText xml:space="preserve"> PAGEREF _Toc232347051 \h </w:instrText>
+              <w:instrText xml:space="preserve"> PAGEREF _Toc232353191 \h </w:instrText>
             </w:r>
             <w:r>
               <w:rPr>
@@ -2689,7 +2775,7 @@
                 <w:noProof/>
                 <w:webHidden/>
               </w:rPr>
-              <w:t>22</w:t>
+              <w:t>23</w:t>
             </w:r>
             <w:r>
               <w:rPr>
@@ -2713,7 +2799,7 @@
               <w:sz w:val="24"/>
             </w:rPr>
           </w:pPr>
-          <w:hyperlink w:anchor="_Toc232347052" w:history="1">
+          <w:hyperlink w:anchor="_Toc232353192" w:history="1">
             <w:r>
               <w:rPr>
                 <w:rStyle w:val="Lienhypertexte"/>
@@ -2755,7 +2841,7 @@
                 <w:noProof/>
                 <w:webHidden/>
               </w:rPr>
-              <w:instrText xml:space="preserve"> PAGEREF _Toc232347052 \h </w:instrText>
+              <w:instrText xml:space="preserve"> PAGEREF _Toc232353192 \h </w:instrText>
             </w:r>
             <w:r>
               <w:rPr>
@@ -2775,7 +2861,7 @@
                 <w:noProof/>
                 <w:webHidden/>
               </w:rPr>
-              <w:t>23</w:t>
+              <w:t>24</w:t>
             </w:r>
             <w:r>
               <w:rPr>
@@ -2799,7 +2885,7 @@
               <w:sz w:val="24"/>
             </w:rPr>
           </w:pPr>
-          <w:hyperlink w:anchor="_Toc232347053" w:history="1">
+          <w:hyperlink w:anchor="_Toc232353193" w:history="1">
             <w:r>
               <w:rPr>
                 <w:rStyle w:val="Lienhypertexte"/>
@@ -2841,7 +2927,7 @@
                 <w:noProof/>
                 <w:webHidden/>
               </w:rPr>
-              <w:instrText xml:space="preserve"> PAGEREF _Toc232347053 \h </w:instrText>
+              <w:instrText xml:space="preserve"> PAGEREF _Toc232353193 \h </w:instrText>
             </w:r>
             <w:r>
               <w:rPr>
@@ -2861,7 +2947,523 @@
                 <w:noProof/>
                 <w:webHidden/>
               </w:rPr>
-              <w:t>23</w:t>
+              <w:t>24</w:t>
+            </w:r>
+            <w:r>
+              <w:rPr>
+                <w:noProof/>
+                <w:webHidden/>
+              </w:rPr>
+              <w:fldChar w:fldCharType="end"/>
+            </w:r>
+          </w:hyperlink>
+        </w:p>
+        <w:p>
+          <w:pPr>
+            <w:pStyle w:val="TM2"/>
+            <w:tabs>
+              <w:tab w:val="left" w:pos="660"/>
+              <w:tab w:val="right" w:leader="dot" w:pos="9062"/>
+            </w:tabs>
+            <w:rPr>
+              <w:rFonts w:asciiTheme="minorHAnsi" w:eastAsiaTheme="minorEastAsia" w:hAnsiTheme="minorHAnsi"/>
+              <w:noProof/>
+              <w:sz w:val="24"/>
+            </w:rPr>
+          </w:pPr>
+          <w:hyperlink w:anchor="_Toc232353194" w:history="1">
+            <w:r>
+              <w:rPr>
+                <w:rStyle w:val="Lienhypertexte"/>
+                <w:noProof/>
+              </w:rPr>
+              <w:t>I.</w:t>
+            </w:r>
+            <w:r>
+              <w:rPr>
+                <w:rFonts w:asciiTheme="minorHAnsi" w:eastAsiaTheme="minorEastAsia" w:hAnsiTheme="minorHAnsi"/>
+                <w:noProof/>
+                <w:sz w:val="24"/>
+              </w:rPr>
+              <w:tab/>
+            </w:r>
+            <w:r>
+              <w:rPr>
+                <w:rStyle w:val="Lienhypertexte"/>
+                <w:noProof/>
+              </w:rPr>
+              <w:t>Décodeur</w:t>
+            </w:r>
+            <w:r>
+              <w:rPr>
+                <w:noProof/>
+                <w:webHidden/>
+              </w:rPr>
+              <w:tab/>
+            </w:r>
+            <w:r>
+              <w:rPr>
+                <w:noProof/>
+                <w:webHidden/>
+              </w:rPr>
+              <w:fldChar w:fldCharType="begin"/>
+            </w:r>
+            <w:r>
+              <w:rPr>
+                <w:noProof/>
+                <w:webHidden/>
+              </w:rPr>
+              <w:instrText xml:space="preserve"> PAGEREF _Toc232353194 \h </w:instrText>
+            </w:r>
+            <w:r>
+              <w:rPr>
+                <w:noProof/>
+                <w:webHidden/>
+              </w:rPr>
+            </w:r>
+            <w:r>
+              <w:rPr>
+                <w:noProof/>
+                <w:webHidden/>
+              </w:rPr>
+              <w:fldChar w:fldCharType="separate"/>
+            </w:r>
+            <w:r>
+              <w:rPr>
+                <w:noProof/>
+                <w:webHidden/>
+              </w:rPr>
+              <w:t>26</w:t>
+            </w:r>
+            <w:r>
+              <w:rPr>
+                <w:noProof/>
+                <w:webHidden/>
+              </w:rPr>
+              <w:fldChar w:fldCharType="end"/>
+            </w:r>
+          </w:hyperlink>
+        </w:p>
+        <w:p>
+          <w:pPr>
+            <w:pStyle w:val="TM3"/>
+            <w:tabs>
+              <w:tab w:val="left" w:pos="960"/>
+              <w:tab w:val="right" w:leader="dot" w:pos="9062"/>
+            </w:tabs>
+            <w:rPr>
+              <w:rFonts w:asciiTheme="minorHAnsi" w:eastAsiaTheme="minorEastAsia" w:hAnsiTheme="minorHAnsi"/>
+              <w:noProof/>
+              <w:sz w:val="24"/>
+            </w:rPr>
+          </w:pPr>
+          <w:hyperlink w:anchor="_Toc232353195" w:history="1">
+            <w:r>
+              <w:rPr>
+                <w:rStyle w:val="Lienhypertexte"/>
+                <w:noProof/>
+              </w:rPr>
+              <w:t>1.</w:t>
+            </w:r>
+            <w:r>
+              <w:rPr>
+                <w:rFonts w:asciiTheme="minorHAnsi" w:eastAsiaTheme="minorEastAsia" w:hAnsiTheme="minorHAnsi"/>
+                <w:noProof/>
+                <w:sz w:val="24"/>
+              </w:rPr>
+              <w:tab/>
+            </w:r>
+            <w:r>
+              <w:rPr>
+                <w:rStyle w:val="Lienhypertexte"/>
+                <w:noProof/>
+              </w:rPr>
+              <w:t>Explication du code du décodeur</w:t>
+            </w:r>
+            <w:r>
+              <w:rPr>
+                <w:noProof/>
+                <w:webHidden/>
+              </w:rPr>
+              <w:tab/>
+            </w:r>
+            <w:r>
+              <w:rPr>
+                <w:noProof/>
+                <w:webHidden/>
+              </w:rPr>
+              <w:fldChar w:fldCharType="begin"/>
+            </w:r>
+            <w:r>
+              <w:rPr>
+                <w:noProof/>
+                <w:webHidden/>
+              </w:rPr>
+              <w:instrText xml:space="preserve"> PAGEREF _Toc232353195 \h </w:instrText>
+            </w:r>
+            <w:r>
+              <w:rPr>
+                <w:noProof/>
+                <w:webHidden/>
+              </w:rPr>
+            </w:r>
+            <w:r>
+              <w:rPr>
+                <w:noProof/>
+                <w:webHidden/>
+              </w:rPr>
+              <w:fldChar w:fldCharType="separate"/>
+            </w:r>
+            <w:r>
+              <w:rPr>
+                <w:noProof/>
+                <w:webHidden/>
+              </w:rPr>
+              <w:t>26</w:t>
+            </w:r>
+            <w:r>
+              <w:rPr>
+                <w:noProof/>
+                <w:webHidden/>
+              </w:rPr>
+              <w:fldChar w:fldCharType="end"/>
+            </w:r>
+          </w:hyperlink>
+        </w:p>
+        <w:p>
+          <w:pPr>
+            <w:pStyle w:val="TM4"/>
+            <w:tabs>
+              <w:tab w:val="left" w:pos="1200"/>
+              <w:tab w:val="right" w:leader="dot" w:pos="9062"/>
+            </w:tabs>
+            <w:rPr>
+              <w:rFonts w:asciiTheme="minorHAnsi" w:eastAsiaTheme="minorEastAsia" w:hAnsiTheme="minorHAnsi"/>
+              <w:noProof/>
+              <w:sz w:val="24"/>
+            </w:rPr>
+          </w:pPr>
+          <w:hyperlink w:anchor="_Toc232353196" w:history="1">
+            <w:r>
+              <w:rPr>
+                <w:rStyle w:val="Lienhypertexte"/>
+                <w:noProof/>
+              </w:rPr>
+              <w:t>a)</w:t>
+            </w:r>
+            <w:r>
+              <w:rPr>
+                <w:rFonts w:asciiTheme="minorHAnsi" w:eastAsiaTheme="minorEastAsia" w:hAnsiTheme="minorHAnsi"/>
+                <w:noProof/>
+                <w:sz w:val="24"/>
+              </w:rPr>
+              <w:tab/>
+            </w:r>
+            <w:r>
+              <w:rPr>
+                <w:rStyle w:val="Lienhypertexte"/>
+                <w:noProof/>
+              </w:rPr>
+              <w:t>Valeur des commandes</w:t>
+            </w:r>
+            <w:r>
+              <w:rPr>
+                <w:noProof/>
+                <w:webHidden/>
+              </w:rPr>
+              <w:tab/>
+            </w:r>
+            <w:r>
+              <w:rPr>
+                <w:noProof/>
+                <w:webHidden/>
+              </w:rPr>
+              <w:fldChar w:fldCharType="begin"/>
+            </w:r>
+            <w:r>
+              <w:rPr>
+                <w:noProof/>
+                <w:webHidden/>
+              </w:rPr>
+              <w:instrText xml:space="preserve"> PAGEREF _Toc232353196 \h </w:instrText>
+            </w:r>
+            <w:r>
+              <w:rPr>
+                <w:noProof/>
+                <w:webHidden/>
+              </w:rPr>
+            </w:r>
+            <w:r>
+              <w:rPr>
+                <w:noProof/>
+                <w:webHidden/>
+              </w:rPr>
+              <w:fldChar w:fldCharType="separate"/>
+            </w:r>
+            <w:r>
+              <w:rPr>
+                <w:noProof/>
+                <w:webHidden/>
+              </w:rPr>
+              <w:t>27</w:t>
+            </w:r>
+            <w:r>
+              <w:rPr>
+                <w:noProof/>
+                <w:webHidden/>
+              </w:rPr>
+              <w:fldChar w:fldCharType="end"/>
+            </w:r>
+          </w:hyperlink>
+        </w:p>
+        <w:p>
+          <w:pPr>
+            <w:pStyle w:val="TM3"/>
+            <w:tabs>
+              <w:tab w:val="left" w:pos="960"/>
+              <w:tab w:val="right" w:leader="dot" w:pos="9062"/>
+            </w:tabs>
+            <w:rPr>
+              <w:rFonts w:asciiTheme="minorHAnsi" w:eastAsiaTheme="minorEastAsia" w:hAnsiTheme="minorHAnsi"/>
+              <w:noProof/>
+              <w:sz w:val="24"/>
+            </w:rPr>
+          </w:pPr>
+          <w:hyperlink w:anchor="_Toc232353197" w:history="1">
+            <w:r>
+              <w:rPr>
+                <w:rStyle w:val="Lienhypertexte"/>
+                <w:noProof/>
+              </w:rPr>
+              <w:t>2.</w:t>
+            </w:r>
+            <w:r>
+              <w:rPr>
+                <w:rFonts w:asciiTheme="minorHAnsi" w:eastAsiaTheme="minorEastAsia" w:hAnsiTheme="minorHAnsi"/>
+                <w:noProof/>
+                <w:sz w:val="24"/>
+              </w:rPr>
+              <w:tab/>
+            </w:r>
+            <w:r>
+              <w:rPr>
+                <w:rStyle w:val="Lienhypertexte"/>
+                <w:noProof/>
+              </w:rPr>
+              <w:t>Explication du banc de test de l’Unité de Gestion d’Instruction</w:t>
+            </w:r>
+            <w:r>
+              <w:rPr>
+                <w:noProof/>
+                <w:webHidden/>
+              </w:rPr>
+              <w:tab/>
+            </w:r>
+            <w:r>
+              <w:rPr>
+                <w:noProof/>
+                <w:webHidden/>
+              </w:rPr>
+              <w:fldChar w:fldCharType="begin"/>
+            </w:r>
+            <w:r>
+              <w:rPr>
+                <w:noProof/>
+                <w:webHidden/>
+              </w:rPr>
+              <w:instrText xml:space="preserve"> PAGEREF _Toc232353197 \h </w:instrText>
+            </w:r>
+            <w:r>
+              <w:rPr>
+                <w:noProof/>
+                <w:webHidden/>
+              </w:rPr>
+            </w:r>
+            <w:r>
+              <w:rPr>
+                <w:noProof/>
+                <w:webHidden/>
+              </w:rPr>
+              <w:fldChar w:fldCharType="separate"/>
+            </w:r>
+            <w:r>
+              <w:rPr>
+                <w:noProof/>
+                <w:webHidden/>
+              </w:rPr>
+              <w:t>27</w:t>
+            </w:r>
+            <w:r>
+              <w:rPr>
+                <w:noProof/>
+                <w:webHidden/>
+              </w:rPr>
+              <w:fldChar w:fldCharType="end"/>
+            </w:r>
+          </w:hyperlink>
+        </w:p>
+        <w:p>
+          <w:pPr>
+            <w:pStyle w:val="TM3"/>
+            <w:tabs>
+              <w:tab w:val="left" w:pos="960"/>
+              <w:tab w:val="right" w:leader="dot" w:pos="9062"/>
+            </w:tabs>
+            <w:rPr>
+              <w:rFonts w:asciiTheme="minorHAnsi" w:eastAsiaTheme="minorEastAsia" w:hAnsiTheme="minorHAnsi"/>
+              <w:noProof/>
+              <w:sz w:val="24"/>
+            </w:rPr>
+          </w:pPr>
+          <w:hyperlink w:anchor="_Toc232353198" w:history="1">
+            <w:r>
+              <w:rPr>
+                <w:rStyle w:val="Lienhypertexte"/>
+                <w:noProof/>
+              </w:rPr>
+              <w:t>3.</w:t>
+            </w:r>
+            <w:r>
+              <w:rPr>
+                <w:rFonts w:asciiTheme="minorHAnsi" w:eastAsiaTheme="minorEastAsia" w:hAnsiTheme="minorHAnsi"/>
+                <w:noProof/>
+                <w:sz w:val="24"/>
+              </w:rPr>
+              <w:tab/>
+            </w:r>
+            <w:r>
+              <w:rPr>
+                <w:rStyle w:val="Lienhypertexte"/>
+                <w:noProof/>
+              </w:rPr>
+              <w:t>Résultat de la simulation de l’Unité de Gestion d’Instruction</w:t>
+            </w:r>
+            <w:r>
+              <w:rPr>
+                <w:noProof/>
+                <w:webHidden/>
+              </w:rPr>
+              <w:tab/>
+            </w:r>
+            <w:r>
+              <w:rPr>
+                <w:noProof/>
+                <w:webHidden/>
+              </w:rPr>
+              <w:fldChar w:fldCharType="begin"/>
+            </w:r>
+            <w:r>
+              <w:rPr>
+                <w:noProof/>
+                <w:webHidden/>
+              </w:rPr>
+              <w:instrText xml:space="preserve"> PAGEREF _Toc232353198 \h </w:instrText>
+            </w:r>
+            <w:r>
+              <w:rPr>
+                <w:noProof/>
+                <w:webHidden/>
+              </w:rPr>
+            </w:r>
+            <w:r>
+              <w:rPr>
+                <w:noProof/>
+                <w:webHidden/>
+              </w:rPr>
+              <w:fldChar w:fldCharType="separate"/>
+            </w:r>
+            <w:r>
+              <w:rPr>
+                <w:noProof/>
+                <w:webHidden/>
+              </w:rPr>
+              <w:t>28</w:t>
+            </w:r>
+            <w:r>
+              <w:rPr>
+                <w:noProof/>
+                <w:webHidden/>
+              </w:rPr>
+              <w:fldChar w:fldCharType="end"/>
+            </w:r>
+          </w:hyperlink>
+        </w:p>
+        <w:p>
+          <w:pPr>
+            <w:pStyle w:val="TM1"/>
+            <w:tabs>
+              <w:tab w:val="left" w:pos="480"/>
+              <w:tab w:val="right" w:leader="dot" w:pos="9062"/>
+            </w:tabs>
+            <w:rPr>
+              <w:rFonts w:asciiTheme="minorHAnsi" w:eastAsiaTheme="minorEastAsia" w:hAnsiTheme="minorHAnsi"/>
+              <w:noProof/>
+              <w:sz w:val="24"/>
+            </w:rPr>
+          </w:pPr>
+          <w:hyperlink w:anchor="_Toc232353199" w:history="1">
+            <w:r>
+              <w:rPr>
+                <w:rStyle w:val="Lienhypertexte"/>
+                <w:noProof/>
+              </w:rPr>
+              <w:t>III.</w:t>
+            </w:r>
+            <w:r>
+              <w:rPr>
+                <w:rFonts w:asciiTheme="minorHAnsi" w:eastAsiaTheme="minorEastAsia" w:hAnsiTheme="minorHAnsi"/>
+                <w:noProof/>
+                <w:sz w:val="24"/>
+              </w:rPr>
+              <w:tab/>
+            </w:r>
+            <w:r>
+              <w:rPr>
+                <w:rStyle w:val="Lienhypertexte"/>
+                <w:noProof/>
+              </w:rPr>
+              <w:t>Validation du processeur monocycle</w:t>
+            </w:r>
+            <w:r>
+              <w:rPr>
+                <w:noProof/>
+                <w:webHidden/>
+              </w:rPr>
+              <w:tab/>
+            </w:r>
+            <w:r>
+              <w:rPr>
+                <w:noProof/>
+                <w:webHidden/>
+              </w:rPr>
+              <w:fldChar w:fldCharType="begin"/>
+            </w:r>
+            <w:r>
+              <w:rPr>
+                <w:noProof/>
+                <w:webHidden/>
+              </w:rPr>
+              <w:instrText xml:space="preserve"> PAGEREF _Toc232353199 \h </w:instrText>
+            </w:r>
+            <w:r>
+              <w:rPr>
+                <w:noProof/>
+                <w:webHidden/>
+              </w:rPr>
+            </w:r>
+            <w:r>
+              <w:rPr>
+                <w:noProof/>
+                <w:webHidden/>
+              </w:rPr>
+              <w:fldChar w:fldCharType="separate"/>
+            </w:r>
+            <w:r>
+              <w:rPr>
+                <w:noProof/>
+                <w:webHidden/>
+              </w:rPr>
+              <w:t>29</w:t>
             </w:r>
             <w:r>
               <w:rPr>
@@ -2885,13 +3487,13 @@
               <w:sz w:val="24"/>
             </w:rPr>
           </w:pPr>
-          <w:hyperlink w:anchor="_Toc232347054" w:history="1">
+          <w:hyperlink w:anchor="_Toc232353200" w:history="1">
             <w:r>
               <w:rPr>
                 <w:rStyle w:val="Lienhypertexte"/>
                 <w:noProof/>
               </w:rPr>
-              <w:t>H.</w:t>
+              <w:t>A.</w:t>
             </w:r>
             <w:r>
               <w:rPr>
@@ -2906,7 +3508,7 @@
                 <w:rStyle w:val="Lienhypertexte"/>
                 <w:noProof/>
               </w:rPr>
-              <w:t>Décodeur</w:t>
+              <w:t>Explication du banc de test</w:t>
             </w:r>
             <w:r>
               <w:rPr>
@@ -2927,7 +3529,7 @@
                 <w:noProof/>
                 <w:webHidden/>
               </w:rPr>
-              <w:instrText xml:space="preserve"> PAGEREF _Toc232347054 \h </w:instrText>
+              <w:instrText xml:space="preserve"> PAGEREF _Toc232353200 \h </w:instrText>
             </w:r>
             <w:r>
               <w:rPr>
@@ -2947,7 +3549,7 @@
                 <w:noProof/>
                 <w:webHidden/>
               </w:rPr>
-              <w:t>25</w:t>
+              <w:t>29</w:t>
             </w:r>
             <w:r>
               <w:rPr>
@@ -2960,7 +3562,7 @@
         </w:p>
         <w:p>
           <w:pPr>
-            <w:pStyle w:val="TM3"/>
+            <w:pStyle w:val="TM2"/>
             <w:tabs>
               <w:tab w:val="left" w:pos="960"/>
               <w:tab w:val="right" w:leader="dot" w:pos="9062"/>
@@ -2971,13 +3573,13 @@
               <w:sz w:val="24"/>
             </w:rPr>
           </w:pPr>
-          <w:hyperlink w:anchor="_Toc232347055" w:history="1">
+          <w:hyperlink w:anchor="_Toc232353201" w:history="1">
             <w:r>
               <w:rPr>
                 <w:rStyle w:val="Lienhypertexte"/>
                 <w:noProof/>
               </w:rPr>
-              <w:t>1.</w:t>
+              <w:t>B.</w:t>
             </w:r>
             <w:r>
               <w:rPr>
@@ -2992,7 +3594,7 @@
                 <w:rStyle w:val="Lienhypertexte"/>
                 <w:noProof/>
               </w:rPr>
-              <w:t>Explication du code du décodeur</w:t>
+              <w:t>Programme exécuté par le processeur monocycle</w:t>
             </w:r>
             <w:r>
               <w:rPr>
@@ -3013,7 +3615,7 @@
                 <w:noProof/>
                 <w:webHidden/>
               </w:rPr>
-              <w:instrText xml:space="preserve"> PAGEREF _Toc232347055 \h </w:instrText>
+              <w:instrText xml:space="preserve"> PAGEREF _Toc232353201 \h </w:instrText>
             </w:r>
             <w:r>
               <w:rPr>
@@ -3033,7 +3635,7 @@
                 <w:noProof/>
                 <w:webHidden/>
               </w:rPr>
-              <w:t>25</w:t>
+              <w:t>30</w:t>
             </w:r>
             <w:r>
               <w:rPr>
@@ -3046,93 +3648,7 @@
         </w:p>
         <w:p>
           <w:pPr>
-            <w:pStyle w:val="TM4"/>
-            <w:tabs>
-              <w:tab w:val="left" w:pos="1200"/>
-              <w:tab w:val="right" w:leader="dot" w:pos="9062"/>
-            </w:tabs>
-            <w:rPr>
-              <w:rFonts w:asciiTheme="minorHAnsi" w:eastAsiaTheme="minorEastAsia" w:hAnsiTheme="minorHAnsi"/>
-              <w:noProof/>
-              <w:sz w:val="24"/>
-            </w:rPr>
-          </w:pPr>
-          <w:hyperlink w:anchor="_Toc232347056" w:history="1">
-            <w:r>
-              <w:rPr>
-                <w:rStyle w:val="Lienhypertexte"/>
-                <w:noProof/>
-              </w:rPr>
-              <w:t>a)</w:t>
-            </w:r>
-            <w:r>
-              <w:rPr>
-                <w:rFonts w:asciiTheme="minorHAnsi" w:eastAsiaTheme="minorEastAsia" w:hAnsiTheme="minorHAnsi"/>
-                <w:noProof/>
-                <w:sz w:val="24"/>
-              </w:rPr>
-              <w:tab/>
-            </w:r>
-            <w:r>
-              <w:rPr>
-                <w:rStyle w:val="Lienhypertexte"/>
-                <w:noProof/>
-              </w:rPr>
-              <w:t>Valeur des commandes</w:t>
-            </w:r>
-            <w:r>
-              <w:rPr>
-                <w:noProof/>
-                <w:webHidden/>
-              </w:rPr>
-              <w:tab/>
-            </w:r>
-            <w:r>
-              <w:rPr>
-                <w:noProof/>
-                <w:webHidden/>
-              </w:rPr>
-              <w:fldChar w:fldCharType="begin"/>
-            </w:r>
-            <w:r>
-              <w:rPr>
-                <w:noProof/>
-                <w:webHidden/>
-              </w:rPr>
-              <w:instrText xml:space="preserve"> PAGEREF _Toc232347056 \h </w:instrText>
-            </w:r>
-            <w:r>
-              <w:rPr>
-                <w:noProof/>
-                <w:webHidden/>
-              </w:rPr>
-            </w:r>
-            <w:r>
-              <w:rPr>
-                <w:noProof/>
-                <w:webHidden/>
-              </w:rPr>
-              <w:fldChar w:fldCharType="separate"/>
-            </w:r>
-            <w:r>
-              <w:rPr>
-                <w:noProof/>
-                <w:webHidden/>
-              </w:rPr>
-              <w:t>26</w:t>
-            </w:r>
-            <w:r>
-              <w:rPr>
-                <w:noProof/>
-                <w:webHidden/>
-              </w:rPr>
-              <w:fldChar w:fldCharType="end"/>
-            </w:r>
-          </w:hyperlink>
-        </w:p>
-        <w:p>
-          <w:pPr>
-            <w:pStyle w:val="TM3"/>
+            <w:pStyle w:val="TM2"/>
             <w:tabs>
               <w:tab w:val="left" w:pos="960"/>
               <w:tab w:val="right" w:leader="dot" w:pos="9062"/>
@@ -3143,13 +3659,13 @@
               <w:sz w:val="24"/>
             </w:rPr>
           </w:pPr>
-          <w:hyperlink w:anchor="_Toc232347057" w:history="1">
+          <w:hyperlink w:anchor="_Toc232353202" w:history="1">
             <w:r>
               <w:rPr>
                 <w:rStyle w:val="Lienhypertexte"/>
                 <w:noProof/>
               </w:rPr>
-              <w:t>2.</w:t>
+              <w:t>C.</w:t>
             </w:r>
             <w:r>
               <w:rPr>
@@ -3164,7 +3680,7 @@
                 <w:rStyle w:val="Lienhypertexte"/>
                 <w:noProof/>
               </w:rPr>
-              <w:t>Explication du banc de test de l’Unité de Gestion d’Instruction</w:t>
+              <w:t>Analyse de la simulation</w:t>
             </w:r>
             <w:r>
               <w:rPr>
@@ -3185,7 +3701,7 @@
                 <w:noProof/>
                 <w:webHidden/>
               </w:rPr>
-              <w:instrText xml:space="preserve"> PAGEREF _Toc232347057 \h </w:instrText>
+              <w:instrText xml:space="preserve"> PAGEREF _Toc232353202 \h </w:instrText>
             </w:r>
             <w:r>
               <w:rPr>
@@ -3205,93 +3721,7 @@
                 <w:noProof/>
                 <w:webHidden/>
               </w:rPr>
-              <w:t>26</w:t>
-            </w:r>
-            <w:r>
-              <w:rPr>
-                <w:noProof/>
-                <w:webHidden/>
-              </w:rPr>
-              <w:fldChar w:fldCharType="end"/>
-            </w:r>
-          </w:hyperlink>
-        </w:p>
-        <w:p>
-          <w:pPr>
-            <w:pStyle w:val="TM3"/>
-            <w:tabs>
-              <w:tab w:val="left" w:pos="960"/>
-              <w:tab w:val="right" w:leader="dot" w:pos="9062"/>
-            </w:tabs>
-            <w:rPr>
-              <w:rFonts w:asciiTheme="minorHAnsi" w:eastAsiaTheme="minorEastAsia" w:hAnsiTheme="minorHAnsi"/>
-              <w:noProof/>
-              <w:sz w:val="24"/>
-            </w:rPr>
-          </w:pPr>
-          <w:hyperlink w:anchor="_Toc232347058" w:history="1">
-            <w:r>
-              <w:rPr>
-                <w:rStyle w:val="Lienhypertexte"/>
-                <w:noProof/>
-              </w:rPr>
-              <w:t>3.</w:t>
-            </w:r>
-            <w:r>
-              <w:rPr>
-                <w:rFonts w:asciiTheme="minorHAnsi" w:eastAsiaTheme="minorEastAsia" w:hAnsiTheme="minorHAnsi"/>
-                <w:noProof/>
-                <w:sz w:val="24"/>
-              </w:rPr>
-              <w:tab/>
-            </w:r>
-            <w:r>
-              <w:rPr>
-                <w:rStyle w:val="Lienhypertexte"/>
-                <w:noProof/>
-              </w:rPr>
-              <w:t>Résultat de la simulation de l’Unité de Gestion d’Instruction</w:t>
-            </w:r>
-            <w:r>
-              <w:rPr>
-                <w:noProof/>
-                <w:webHidden/>
-              </w:rPr>
-              <w:tab/>
-            </w:r>
-            <w:r>
-              <w:rPr>
-                <w:noProof/>
-                <w:webHidden/>
-              </w:rPr>
-              <w:fldChar w:fldCharType="begin"/>
-            </w:r>
-            <w:r>
-              <w:rPr>
-                <w:noProof/>
-                <w:webHidden/>
-              </w:rPr>
-              <w:instrText xml:space="preserve"> PAGEREF _Toc232347058 \h </w:instrText>
-            </w:r>
-            <w:r>
-              <w:rPr>
-                <w:noProof/>
-                <w:webHidden/>
-              </w:rPr>
-            </w:r>
-            <w:r>
-              <w:rPr>
-                <w:noProof/>
-                <w:webHidden/>
-              </w:rPr>
-              <w:fldChar w:fldCharType="separate"/>
-            </w:r>
-            <w:r>
-              <w:rPr>
-                <w:noProof/>
-                <w:webHidden/>
-              </w:rPr>
-              <w:t>27</w:t>
+              <w:t>30</w:t>
             </w:r>
             <w:r>
               <w:rPr>
@@ -3315,13 +3745,13 @@
               <w:sz w:val="24"/>
             </w:rPr>
           </w:pPr>
-          <w:hyperlink w:anchor="_Toc232347059" w:history="1">
+          <w:hyperlink w:anchor="_Toc232353203" w:history="1">
             <w:r>
               <w:rPr>
                 <w:rStyle w:val="Lienhypertexte"/>
                 <w:noProof/>
               </w:rPr>
-              <w:t>III.</w:t>
+              <w:t>IV.</w:t>
             </w:r>
             <w:r>
               <w:rPr>
@@ -3336,7 +3766,7 @@
                 <w:rStyle w:val="Lienhypertexte"/>
                 <w:noProof/>
               </w:rPr>
-              <w:t>Validation du processeur monocycle</w:t>
+              <w:t>Quartus prime</w:t>
             </w:r>
             <w:r>
               <w:rPr>
@@ -3357,7 +3787,7 @@
                 <w:noProof/>
                 <w:webHidden/>
               </w:rPr>
-              <w:instrText xml:space="preserve"> PAGEREF _Toc232347059 \h </w:instrText>
+              <w:instrText xml:space="preserve"> PAGEREF _Toc232353203 \h </w:instrText>
             </w:r>
             <w:r>
               <w:rPr>
@@ -3377,7 +3807,7 @@
                 <w:noProof/>
                 <w:webHidden/>
               </w:rPr>
-              <w:t>28</w:t>
+              <w:t>35</w:t>
             </w:r>
             <w:r>
               <w:rPr>
@@ -3401,7 +3831,7 @@
               <w:sz w:val="24"/>
             </w:rPr>
           </w:pPr>
-          <w:hyperlink w:anchor="_Toc232347060" w:history="1">
+          <w:hyperlink w:anchor="_Toc232353204" w:history="1">
             <w:r>
               <w:rPr>
                 <w:rStyle w:val="Lienhypertexte"/>
@@ -3422,7 +3852,7 @@
                 <w:rStyle w:val="Lienhypertexte"/>
                 <w:noProof/>
               </w:rPr>
-              <w:t>Explication du banc de test</w:t>
+              <w:t>Preuve de fonctionnement sur FPGA</w:t>
             </w:r>
             <w:r>
               <w:rPr>
@@ -3443,7 +3873,7 @@
                 <w:noProof/>
                 <w:webHidden/>
               </w:rPr>
-              <w:instrText xml:space="preserve"> PAGEREF _Toc232347060 \h </w:instrText>
+              <w:instrText xml:space="preserve"> PAGEREF _Toc232353204 \h </w:instrText>
             </w:r>
             <w:r>
               <w:rPr>
@@ -3463,351 +3893,7 @@
                 <w:noProof/>
                 <w:webHidden/>
               </w:rPr>
-              <w:t>28</w:t>
-            </w:r>
-            <w:r>
-              <w:rPr>
-                <w:noProof/>
-                <w:webHidden/>
-              </w:rPr>
-              <w:fldChar w:fldCharType="end"/>
-            </w:r>
-          </w:hyperlink>
-        </w:p>
-        <w:p>
-          <w:pPr>
-            <w:pStyle w:val="TM2"/>
-            <w:tabs>
-              <w:tab w:val="left" w:pos="960"/>
-              <w:tab w:val="right" w:leader="dot" w:pos="9062"/>
-            </w:tabs>
-            <w:rPr>
-              <w:rFonts w:asciiTheme="minorHAnsi" w:eastAsiaTheme="minorEastAsia" w:hAnsiTheme="minorHAnsi"/>
-              <w:noProof/>
-              <w:sz w:val="24"/>
-            </w:rPr>
-          </w:pPr>
-          <w:hyperlink w:anchor="_Toc232347061" w:history="1">
-            <w:r>
-              <w:rPr>
-                <w:rStyle w:val="Lienhypertexte"/>
-                <w:noProof/>
-              </w:rPr>
-              <w:t>B.</w:t>
-            </w:r>
-            <w:r>
-              <w:rPr>
-                <w:rFonts w:asciiTheme="minorHAnsi" w:eastAsiaTheme="minorEastAsia" w:hAnsiTheme="minorHAnsi"/>
-                <w:noProof/>
-                <w:sz w:val="24"/>
-              </w:rPr>
-              <w:tab/>
-            </w:r>
-            <w:r>
-              <w:rPr>
-                <w:rStyle w:val="Lienhypertexte"/>
-                <w:noProof/>
-              </w:rPr>
-              <w:t>Programme exécuté par le processeur monocycle</w:t>
-            </w:r>
-            <w:r>
-              <w:rPr>
-                <w:noProof/>
-                <w:webHidden/>
-              </w:rPr>
-              <w:tab/>
-            </w:r>
-            <w:r>
-              <w:rPr>
-                <w:noProof/>
-                <w:webHidden/>
-              </w:rPr>
-              <w:fldChar w:fldCharType="begin"/>
-            </w:r>
-            <w:r>
-              <w:rPr>
-                <w:noProof/>
-                <w:webHidden/>
-              </w:rPr>
-              <w:instrText xml:space="preserve"> PAGEREF _Toc232347061 \h </w:instrText>
-            </w:r>
-            <w:r>
-              <w:rPr>
-                <w:noProof/>
-                <w:webHidden/>
-              </w:rPr>
-            </w:r>
-            <w:r>
-              <w:rPr>
-                <w:noProof/>
-                <w:webHidden/>
-              </w:rPr>
-              <w:fldChar w:fldCharType="separate"/>
-            </w:r>
-            <w:r>
-              <w:rPr>
-                <w:noProof/>
-                <w:webHidden/>
-              </w:rPr>
-              <w:t>29</w:t>
-            </w:r>
-            <w:r>
-              <w:rPr>
-                <w:noProof/>
-                <w:webHidden/>
-              </w:rPr>
-              <w:fldChar w:fldCharType="end"/>
-            </w:r>
-          </w:hyperlink>
-        </w:p>
-        <w:p>
-          <w:pPr>
-            <w:pStyle w:val="TM2"/>
-            <w:tabs>
-              <w:tab w:val="left" w:pos="960"/>
-              <w:tab w:val="right" w:leader="dot" w:pos="9062"/>
-            </w:tabs>
-            <w:rPr>
-              <w:rFonts w:asciiTheme="minorHAnsi" w:eastAsiaTheme="minorEastAsia" w:hAnsiTheme="minorHAnsi"/>
-              <w:noProof/>
-              <w:sz w:val="24"/>
-            </w:rPr>
-          </w:pPr>
-          <w:hyperlink w:anchor="_Toc232347062" w:history="1">
-            <w:r>
-              <w:rPr>
-                <w:rStyle w:val="Lienhypertexte"/>
-                <w:noProof/>
-              </w:rPr>
-              <w:t>C.</w:t>
-            </w:r>
-            <w:r>
-              <w:rPr>
-                <w:rFonts w:asciiTheme="minorHAnsi" w:eastAsiaTheme="minorEastAsia" w:hAnsiTheme="minorHAnsi"/>
-                <w:noProof/>
-                <w:sz w:val="24"/>
-              </w:rPr>
-              <w:tab/>
-            </w:r>
-            <w:r>
-              <w:rPr>
-                <w:rStyle w:val="Lienhypertexte"/>
-                <w:noProof/>
-              </w:rPr>
-              <w:t>Analyse de la simulation</w:t>
-            </w:r>
-            <w:r>
-              <w:rPr>
-                <w:noProof/>
-                <w:webHidden/>
-              </w:rPr>
-              <w:tab/>
-            </w:r>
-            <w:r>
-              <w:rPr>
-                <w:noProof/>
-                <w:webHidden/>
-              </w:rPr>
-              <w:fldChar w:fldCharType="begin"/>
-            </w:r>
-            <w:r>
-              <w:rPr>
-                <w:noProof/>
-                <w:webHidden/>
-              </w:rPr>
-              <w:instrText xml:space="preserve"> PAGEREF _Toc232347062 \h </w:instrText>
-            </w:r>
-            <w:r>
-              <w:rPr>
-                <w:noProof/>
-                <w:webHidden/>
-              </w:rPr>
-            </w:r>
-            <w:r>
-              <w:rPr>
-                <w:noProof/>
-                <w:webHidden/>
-              </w:rPr>
-              <w:fldChar w:fldCharType="separate"/>
-            </w:r>
-            <w:r>
-              <w:rPr>
-                <w:noProof/>
-                <w:webHidden/>
-              </w:rPr>
-              <w:t>29</w:t>
-            </w:r>
-            <w:r>
-              <w:rPr>
-                <w:noProof/>
-                <w:webHidden/>
-              </w:rPr>
-              <w:fldChar w:fldCharType="end"/>
-            </w:r>
-          </w:hyperlink>
-        </w:p>
-        <w:p>
-          <w:pPr>
-            <w:pStyle w:val="TM1"/>
-            <w:tabs>
-              <w:tab w:val="left" w:pos="480"/>
-              <w:tab w:val="right" w:leader="dot" w:pos="9062"/>
-            </w:tabs>
-            <w:rPr>
-              <w:rFonts w:asciiTheme="minorHAnsi" w:eastAsiaTheme="minorEastAsia" w:hAnsiTheme="minorHAnsi"/>
-              <w:noProof/>
-              <w:sz w:val="24"/>
-            </w:rPr>
-          </w:pPr>
-          <w:hyperlink w:anchor="_Toc232347063" w:history="1">
-            <w:r>
-              <w:rPr>
-                <w:rStyle w:val="Lienhypertexte"/>
-                <w:noProof/>
-              </w:rPr>
-              <w:t>IV.</w:t>
-            </w:r>
-            <w:r>
-              <w:rPr>
-                <w:rFonts w:asciiTheme="minorHAnsi" w:eastAsiaTheme="minorEastAsia" w:hAnsiTheme="minorHAnsi"/>
-                <w:noProof/>
-                <w:sz w:val="24"/>
-              </w:rPr>
-              <w:tab/>
-            </w:r>
-            <w:r>
-              <w:rPr>
-                <w:rStyle w:val="Lienhypertexte"/>
-                <w:noProof/>
-              </w:rPr>
-              <w:t>Quartus prime</w:t>
-            </w:r>
-            <w:r>
-              <w:rPr>
-                <w:noProof/>
-                <w:webHidden/>
-              </w:rPr>
-              <w:tab/>
-            </w:r>
-            <w:r>
-              <w:rPr>
-                <w:noProof/>
-                <w:webHidden/>
-              </w:rPr>
-              <w:fldChar w:fldCharType="begin"/>
-            </w:r>
-            <w:r>
-              <w:rPr>
-                <w:noProof/>
-                <w:webHidden/>
-              </w:rPr>
-              <w:instrText xml:space="preserve"> PAGEREF _Toc232347063 \h </w:instrText>
-            </w:r>
-            <w:r>
-              <w:rPr>
-                <w:noProof/>
-                <w:webHidden/>
-              </w:rPr>
-            </w:r>
-            <w:r>
-              <w:rPr>
-                <w:noProof/>
-                <w:webHidden/>
-              </w:rPr>
-              <w:fldChar w:fldCharType="separate"/>
-            </w:r>
-            <w:r>
-              <w:rPr>
-                <w:noProof/>
-                <w:webHidden/>
-              </w:rPr>
-              <w:t>34</w:t>
-            </w:r>
-            <w:r>
-              <w:rPr>
-                <w:noProof/>
-                <w:webHidden/>
-              </w:rPr>
-              <w:fldChar w:fldCharType="end"/>
-            </w:r>
-          </w:hyperlink>
-        </w:p>
-        <w:p>
-          <w:pPr>
-            <w:pStyle w:val="TM2"/>
-            <w:tabs>
-              <w:tab w:val="left" w:pos="960"/>
-              <w:tab w:val="right" w:leader="dot" w:pos="9062"/>
-            </w:tabs>
-            <w:rPr>
-              <w:rFonts w:asciiTheme="minorHAnsi" w:eastAsiaTheme="minorEastAsia" w:hAnsiTheme="minorHAnsi"/>
-              <w:noProof/>
-              <w:sz w:val="24"/>
-            </w:rPr>
-          </w:pPr>
-          <w:hyperlink w:anchor="_Toc232347064" w:history="1">
-            <w:r>
-              <w:rPr>
-                <w:rStyle w:val="Lienhypertexte"/>
-                <w:noProof/>
-              </w:rPr>
-              <w:t>A.</w:t>
-            </w:r>
-            <w:r>
-              <w:rPr>
-                <w:rFonts w:asciiTheme="minorHAnsi" w:eastAsiaTheme="minorEastAsia" w:hAnsiTheme="minorHAnsi"/>
-                <w:noProof/>
-                <w:sz w:val="24"/>
-              </w:rPr>
-              <w:tab/>
-            </w:r>
-            <w:r>
-              <w:rPr>
-                <w:rStyle w:val="Lienhypertexte"/>
-                <w:noProof/>
-              </w:rPr>
-              <w:t>Preuve de fonctionnement sur FPGA</w:t>
-            </w:r>
-            <w:r>
-              <w:rPr>
-                <w:noProof/>
-                <w:webHidden/>
-              </w:rPr>
-              <w:tab/>
-            </w:r>
-            <w:r>
-              <w:rPr>
-                <w:noProof/>
-                <w:webHidden/>
-              </w:rPr>
-              <w:fldChar w:fldCharType="begin"/>
-            </w:r>
-            <w:r>
-              <w:rPr>
-                <w:noProof/>
-                <w:webHidden/>
-              </w:rPr>
-              <w:instrText xml:space="preserve"> PAGEREF _Toc232347064 \h </w:instrText>
-            </w:r>
-            <w:r>
-              <w:rPr>
-                <w:noProof/>
-                <w:webHidden/>
-              </w:rPr>
-            </w:r>
-            <w:r>
-              <w:rPr>
-                <w:noProof/>
-                <w:webHidden/>
-              </w:rPr>
-              <w:fldChar w:fldCharType="separate"/>
-            </w:r>
-            <w:r>
-              <w:rPr>
-                <w:noProof/>
-                <w:webHidden/>
-              </w:rPr>
-              <w:t>35</w:t>
+              <w:t>36</w:t>
             </w:r>
             <w:r>
               <w:rPr>
@@ -3830,14 +3916,14 @@
               <w:sz w:val="24"/>
             </w:rPr>
           </w:pPr>
-          <w:hyperlink w:anchor="_Toc232347065" w:history="1">
+          <w:hyperlink w:anchor="_Toc232353205" w:history="1">
             <w:r>
               <w:rPr>
                 <w:rStyle w:val="Lienhypertexte"/>
                 <w:rFonts w:eastAsia="Times New Roman"/>
                 <w:noProof/>
               </w:rPr>
-              <w:t>Sources</w:t>
+              <w:t>Annexe</w:t>
             </w:r>
             <w:r>
               <w:rPr>
@@ -3858,7 +3944,7 @@
                 <w:noProof/>
                 <w:webHidden/>
               </w:rPr>
-              <w:instrText xml:space="preserve"> PAGEREF _Toc232347065 \h </w:instrText>
+              <w:instrText xml:space="preserve"> PAGEREF _Toc232353205 \h </w:instrText>
             </w:r>
             <w:r>
               <w:rPr>
@@ -3878,7 +3964,7 @@
                 <w:noProof/>
                 <w:webHidden/>
               </w:rPr>
-              <w:t>36</w:t>
+              <w:t>38</w:t>
             </w:r>
             <w:r>
               <w:rPr>
@@ -3901,14 +3987,14 @@
               <w:sz w:val="24"/>
             </w:rPr>
           </w:pPr>
-          <w:hyperlink w:anchor="_Toc232347066" w:history="1">
+          <w:hyperlink w:anchor="_Toc232353206" w:history="1">
             <w:r>
               <w:rPr>
                 <w:rStyle w:val="Lienhypertexte"/>
                 <w:rFonts w:eastAsia="Times New Roman"/>
                 <w:noProof/>
               </w:rPr>
-              <w:t>Annexe</w:t>
+              <w:t>Tables des figures</w:t>
             </w:r>
             <w:r>
               <w:rPr>
@@ -3929,7 +4015,7 @@
                 <w:noProof/>
                 <w:webHidden/>
               </w:rPr>
-              <w:instrText xml:space="preserve"> PAGEREF _Toc232347066 \h </w:instrText>
+              <w:instrText xml:space="preserve"> PAGEREF _Toc232353206 \h </w:instrText>
             </w:r>
             <w:r>
               <w:rPr>
@@ -3949,78 +4035,7 @@
                 <w:noProof/>
                 <w:webHidden/>
               </w:rPr>
-              <w:t>37</w:t>
-            </w:r>
-            <w:r>
-              <w:rPr>
-                <w:noProof/>
-                <w:webHidden/>
-              </w:rPr>
-              <w:fldChar w:fldCharType="end"/>
-            </w:r>
-          </w:hyperlink>
-        </w:p>
-        <w:p>
-          <w:pPr>
-            <w:pStyle w:val="TM1"/>
-            <w:tabs>
-              <w:tab w:val="right" w:leader="dot" w:pos="9062"/>
-            </w:tabs>
-            <w:rPr>
-              <w:rFonts w:asciiTheme="minorHAnsi" w:eastAsiaTheme="minorEastAsia" w:hAnsiTheme="minorHAnsi"/>
-              <w:noProof/>
-              <w:sz w:val="24"/>
-            </w:rPr>
-          </w:pPr>
-          <w:hyperlink w:anchor="_Toc232347067" w:history="1">
-            <w:r>
-              <w:rPr>
-                <w:rStyle w:val="Lienhypertexte"/>
-                <w:rFonts w:eastAsia="Times New Roman"/>
-                <w:noProof/>
-              </w:rPr>
-              <w:t>Tables des figures</w:t>
-            </w:r>
-            <w:r>
-              <w:rPr>
-                <w:noProof/>
-                <w:webHidden/>
-              </w:rPr>
-              <w:tab/>
-            </w:r>
-            <w:r>
-              <w:rPr>
-                <w:noProof/>
-                <w:webHidden/>
-              </w:rPr>
-              <w:fldChar w:fldCharType="begin"/>
-            </w:r>
-            <w:r>
-              <w:rPr>
-                <w:noProof/>
-                <w:webHidden/>
-              </w:rPr>
-              <w:instrText xml:space="preserve"> PAGEREF _Toc232347067 \h </w:instrText>
-            </w:r>
-            <w:r>
-              <w:rPr>
-                <w:noProof/>
-                <w:webHidden/>
-              </w:rPr>
-            </w:r>
-            <w:r>
-              <w:rPr>
-                <w:noProof/>
-                <w:webHidden/>
-              </w:rPr>
-              <w:fldChar w:fldCharType="separate"/>
-            </w:r>
-            <w:r>
-              <w:rPr>
-                <w:noProof/>
-                <w:webHidden/>
-              </w:rPr>
-              <w:t>38</w:t>
+              <w:t>39</w:t>
             </w:r>
             <w:r>
               <w:rPr>
@@ -4078,7 +4093,7 @@
           <w:numId w:val="0"/>
         </w:numPr>
       </w:pPr>
-      <w:bookmarkStart w:id="0" w:name="_Toc232347023"/>
+      <w:bookmarkStart w:id="0" w:name="_Toc232353162"/>
       <w:r>
         <w:lastRenderedPageBreak/>
         <w:t>Remerciements</w:t>
@@ -4168,7 +4183,7 @@
           <w:numId w:val="0"/>
         </w:numPr>
       </w:pPr>
-      <w:bookmarkStart w:id="1" w:name="_Toc232347024"/>
+      <w:bookmarkStart w:id="1" w:name="_Toc232353163"/>
       <w:r>
         <w:lastRenderedPageBreak/>
         <w:t>Résumé</w:t>
@@ -4210,7 +4225,7 @@
       <w:pPr>
         <w:pStyle w:val="Titre1"/>
       </w:pPr>
-      <w:bookmarkStart w:id="2" w:name="_Toc232347025"/>
+      <w:bookmarkStart w:id="2" w:name="_Toc232353164"/>
       <w:r>
         <w:lastRenderedPageBreak/>
         <w:t>Présentation</w:t>
@@ -4352,7 +4367,7 @@
       <w:pPr>
         <w:pStyle w:val="Lgende"/>
       </w:pPr>
-      <w:bookmarkStart w:id="3" w:name="_Toc232347068"/>
+      <w:bookmarkStart w:id="3" w:name="_Toc232353207"/>
       <w:r>
         <w:t xml:space="preserve">Figure </w:t>
       </w:r>
@@ -4390,7 +4405,7 @@
       <w:pPr>
         <w:pStyle w:val="Titre1"/>
       </w:pPr>
-      <w:bookmarkStart w:id="4" w:name="_Toc232347026"/>
+      <w:bookmarkStart w:id="4" w:name="_Toc232353165"/>
       <w:r>
         <w:t>Conception et Architecture Fonctionnelle</w:t>
       </w:r>
@@ -4870,7 +4885,7 @@
       <w:pPr>
         <w:pStyle w:val="Titre2"/>
       </w:pPr>
-      <w:bookmarkStart w:id="5" w:name="_Toc232347027"/>
+      <w:bookmarkStart w:id="5" w:name="_Toc232353166"/>
       <w:r>
         <w:t>Unité Arithmétique et Logique (ALU)</w:t>
       </w:r>
@@ -4885,7 +4900,7 @@
       <w:pPr>
         <w:pStyle w:val="Titre3"/>
       </w:pPr>
-      <w:bookmarkStart w:id="6" w:name="_Toc232347028"/>
+      <w:bookmarkStart w:id="6" w:name="_Toc232353167"/>
       <w:r>
         <w:t>Explication du code de l’ALU</w:t>
       </w:r>
@@ -5034,7 +5049,7 @@
       <w:pPr>
         <w:pStyle w:val="Lgende"/>
       </w:pPr>
-      <w:bookmarkStart w:id="7" w:name="_Toc232347069"/>
+      <w:bookmarkStart w:id="7" w:name="_Toc232353208"/>
       <w:r>
         <w:t xml:space="preserve">Figure </w:t>
       </w:r>
@@ -5133,7 +5148,7 @@
       <w:pPr>
         <w:pStyle w:val="Titre3"/>
       </w:pPr>
-      <w:bookmarkStart w:id="8" w:name="_Toc232347029"/>
+      <w:bookmarkStart w:id="8" w:name="_Toc232353168"/>
       <w:r>
         <w:t>Explication du banc de test de l’ALU</w:t>
       </w:r>
@@ -5193,7 +5208,7 @@
       <w:pPr>
         <w:pStyle w:val="Titre3"/>
       </w:pPr>
-      <w:bookmarkStart w:id="9" w:name="_Toc232347030"/>
+      <w:bookmarkStart w:id="9" w:name="_Toc232353169"/>
       <w:r>
         <w:t xml:space="preserve">Résultat </w:t>
       </w:r>
@@ -5385,7 +5400,7 @@
       <w:pPr>
         <w:pStyle w:val="Lgende"/>
       </w:pPr>
-      <w:bookmarkStart w:id="10" w:name="_Toc232347070"/>
+      <w:bookmarkStart w:id="10" w:name="_Toc232353209"/>
       <w:r>
         <w:t xml:space="preserve">Figure </w:t>
       </w:r>
@@ -5416,7 +5431,7 @@
       <w:pPr>
         <w:pStyle w:val="Titre2"/>
       </w:pPr>
-      <w:bookmarkStart w:id="11" w:name="_Toc232347031"/>
+      <w:bookmarkStart w:id="11" w:name="_Toc232353170"/>
       <w:r>
         <w:t>Banc de registre</w:t>
       </w:r>
@@ -5429,7 +5444,7 @@
       <w:pPr>
         <w:pStyle w:val="Titre3"/>
       </w:pPr>
-      <w:bookmarkStart w:id="12" w:name="_Toc232347032"/>
+      <w:bookmarkStart w:id="12" w:name="_Toc232353171"/>
       <w:r>
         <w:t>Explication du code du banc de registre</w:t>
       </w:r>
@@ -5528,7 +5543,7 @@
       <w:pPr>
         <w:pStyle w:val="Lgende"/>
       </w:pPr>
-      <w:bookmarkStart w:id="13" w:name="_Toc232347071"/>
+      <w:bookmarkStart w:id="13" w:name="_Toc232353210"/>
       <w:r>
         <w:t xml:space="preserve">Figure </w:t>
       </w:r>
@@ -5566,7 +5581,7 @@
       <w:pPr>
         <w:pStyle w:val="Titre3"/>
       </w:pPr>
-      <w:bookmarkStart w:id="14" w:name="_Toc232347033"/>
+      <w:bookmarkStart w:id="14" w:name="_Toc232353172"/>
       <w:r>
         <w:t>Explication du banc de test du banc de registre</w:t>
       </w:r>
@@ -5753,7 +5768,7 @@
       <w:pPr>
         <w:pStyle w:val="Titre3"/>
       </w:pPr>
-      <w:bookmarkStart w:id="15" w:name="_Toc232347034"/>
+      <w:bookmarkStart w:id="15" w:name="_Toc232353173"/>
       <w:r>
         <w:t>Résultat de la simulation</w:t>
       </w:r>
@@ -6286,7 +6301,7 @@
       <w:pPr>
         <w:pStyle w:val="Lgende"/>
       </w:pPr>
-      <w:bookmarkStart w:id="16" w:name="_Toc232347072"/>
+      <w:bookmarkStart w:id="16" w:name="_Toc232353211"/>
       <w:r>
         <w:t xml:space="preserve">Figure </w:t>
       </w:r>
@@ -6330,7 +6345,7 @@
       <w:pPr>
         <w:pStyle w:val="Titre2"/>
       </w:pPr>
-      <w:bookmarkStart w:id="17" w:name="_Toc232347035"/>
+      <w:bookmarkStart w:id="17" w:name="_Toc232353174"/>
       <w:r>
         <w:t>Le multiplexeur 2 vers 1</w:t>
       </w:r>
@@ -6340,7 +6355,7 @@
       <w:pPr>
         <w:pStyle w:val="Titre3"/>
       </w:pPr>
-      <w:bookmarkStart w:id="18" w:name="_Toc232347036"/>
+      <w:bookmarkStart w:id="18" w:name="_Toc232353175"/>
       <w:r>
         <w:t>Explication du code du multiplexeur 2 vers 1</w:t>
       </w:r>
@@ -6487,7 +6502,7 @@
       <w:pPr>
         <w:pStyle w:val="Lgende"/>
       </w:pPr>
-      <w:bookmarkStart w:id="19" w:name="_Toc232347073"/>
+      <w:bookmarkStart w:id="19" w:name="_Toc232353212"/>
       <w:r>
         <w:t xml:space="preserve">Figure </w:t>
       </w:r>
@@ -6519,7 +6534,7 @@
       <w:pPr>
         <w:pStyle w:val="Titre3"/>
       </w:pPr>
-      <w:bookmarkStart w:id="20" w:name="_Toc232347037"/>
+      <w:bookmarkStart w:id="20" w:name="_Toc232353176"/>
       <w:r>
         <w:t>Explication du banc de test du multiplexeur 2 vers 1</w:t>
       </w:r>
@@ -6616,7 +6631,7 @@
       <w:pPr>
         <w:pStyle w:val="Titre3"/>
       </w:pPr>
-      <w:bookmarkStart w:id="21" w:name="_Toc232347038"/>
+      <w:bookmarkStart w:id="21" w:name="_Toc232353177"/>
       <w:r>
         <w:t>Résultat de la simulation du multiplexeur 2 vers 1</w:t>
       </w:r>
@@ -6779,7 +6794,7 @@
       <w:pPr>
         <w:pStyle w:val="Lgende"/>
       </w:pPr>
-      <w:bookmarkStart w:id="22" w:name="_Toc232347074"/>
+      <w:bookmarkStart w:id="22" w:name="_Toc232353213"/>
       <w:r>
         <w:t xml:space="preserve">Figure </w:t>
       </w:r>
@@ -6831,7 +6846,7 @@
       <w:pPr>
         <w:pStyle w:val="Titre2"/>
       </w:pPr>
-      <w:bookmarkStart w:id="23" w:name="_Toc232347039"/>
+      <w:bookmarkStart w:id="23" w:name="_Toc232353178"/>
       <w:r>
         <w:lastRenderedPageBreak/>
         <w:t>Extension de signe</w:t>
@@ -6842,7 +6857,7 @@
       <w:pPr>
         <w:pStyle w:val="Titre3"/>
       </w:pPr>
-      <w:bookmarkStart w:id="24" w:name="_Toc232347040"/>
+      <w:bookmarkStart w:id="24" w:name="_Toc232353179"/>
       <w:r>
         <w:t>Explication du code de l’extension du signe</w:t>
       </w:r>
@@ -6976,7 +6991,7 @@
       <w:pPr>
         <w:pStyle w:val="Lgende"/>
       </w:pPr>
-      <w:bookmarkStart w:id="25" w:name="_Toc232347075"/>
+      <w:bookmarkStart w:id="25" w:name="_Toc232353214"/>
       <w:r>
         <w:t xml:space="preserve">Figure </w:t>
       </w:r>
@@ -7014,7 +7029,7 @@
       <w:pPr>
         <w:pStyle w:val="Titre3"/>
       </w:pPr>
-      <w:bookmarkStart w:id="26" w:name="_Toc232347041"/>
+      <w:bookmarkStart w:id="26" w:name="_Toc232353180"/>
       <w:r>
         <w:t>Explication du banc de test du multiplexeur 2 vers 1</w:t>
       </w:r>
@@ -7154,7 +7169,7 @@
       <w:pPr>
         <w:pStyle w:val="Titre3"/>
       </w:pPr>
-      <w:bookmarkStart w:id="27" w:name="_Toc232347042"/>
+      <w:bookmarkStart w:id="27" w:name="_Toc232353181"/>
       <w:r>
         <w:t>Résultat de la simulation du multiplexeur 2 vers 1</w:t>
       </w:r>
@@ -7366,7 +7381,7 @@
           <w:u w:val="single"/>
         </w:rPr>
       </w:pPr>
-      <w:bookmarkStart w:id="28" w:name="_Toc232347076"/>
+      <w:bookmarkStart w:id="28" w:name="_Toc232353215"/>
       <w:r>
         <w:t xml:space="preserve">Figure </w:t>
       </w:r>
@@ -7418,7 +7433,7 @@
       <w:pPr>
         <w:pStyle w:val="Titre2"/>
       </w:pPr>
-      <w:bookmarkStart w:id="29" w:name="_Toc232347043"/>
+      <w:bookmarkStart w:id="29" w:name="_Toc232353182"/>
       <w:r>
         <w:lastRenderedPageBreak/>
         <w:t>Mémoire de données</w:t>
@@ -7429,7 +7444,7 @@
       <w:pPr>
         <w:pStyle w:val="Titre3"/>
       </w:pPr>
-      <w:bookmarkStart w:id="30" w:name="_Toc232347044"/>
+      <w:bookmarkStart w:id="30" w:name="_Toc232353183"/>
       <w:r>
         <w:t>Explication du code sur la mémoire de données</w:t>
       </w:r>
@@ -7581,7 +7596,7 @@
       <w:pPr>
         <w:pStyle w:val="Lgende"/>
       </w:pPr>
-      <w:bookmarkStart w:id="31" w:name="_Toc232347077"/>
+      <w:bookmarkStart w:id="31" w:name="_Toc232353216"/>
       <w:r>
         <w:t xml:space="preserve">Figure </w:t>
       </w:r>
@@ -7619,7 +7634,7 @@
       <w:pPr>
         <w:pStyle w:val="Titre3"/>
       </w:pPr>
-      <w:bookmarkStart w:id="32" w:name="_Toc232347045"/>
+      <w:bookmarkStart w:id="32" w:name="_Toc232353184"/>
       <w:r>
         <w:t>Explication du banc de test sur la mémoire de données</w:t>
       </w:r>
@@ -7772,7 +7787,7 @@
       <w:pPr>
         <w:pStyle w:val="Titre3"/>
       </w:pPr>
-      <w:bookmarkStart w:id="33" w:name="_Toc232347046"/>
+      <w:bookmarkStart w:id="33" w:name="_Toc232353185"/>
       <w:r>
         <w:t>Résultat de la simulation de la mémoire de donnée</w:t>
       </w:r>
@@ -8068,7 +8083,7 @@
       <w:pPr>
         <w:pStyle w:val="Lgende"/>
       </w:pPr>
-      <w:bookmarkStart w:id="34" w:name="_Toc232347078"/>
+      <w:bookmarkStart w:id="34" w:name="_Toc232353217"/>
       <w:r>
         <w:t xml:space="preserve">Figure </w:t>
       </w:r>
@@ -8117,7 +8132,7 @@
       <w:pPr>
         <w:pStyle w:val="Titre2"/>
       </w:pPr>
-      <w:bookmarkStart w:id="35" w:name="_Toc232347047"/>
+      <w:bookmarkStart w:id="35" w:name="_Toc232353186"/>
       <w:r>
         <w:t>Assemblage Unité de Traitement</w:t>
       </w:r>
@@ -8232,7 +8247,7 @@
       <w:pPr>
         <w:pStyle w:val="Lgende"/>
       </w:pPr>
-      <w:bookmarkStart w:id="36" w:name="_Toc232347079"/>
+      <w:bookmarkStart w:id="36" w:name="_Toc232353218"/>
       <w:r>
         <w:t xml:space="preserve">Figure </w:t>
       </w:r>
@@ -8341,7 +8356,7 @@
       <w:pPr>
         <w:pStyle w:val="Lgende"/>
       </w:pPr>
-      <w:bookmarkStart w:id="37" w:name="_Toc232347080"/>
+      <w:bookmarkStart w:id="37" w:name="_Toc232353219"/>
       <w:r>
         <w:t xml:space="preserve">Figure </w:t>
       </w:r>
@@ -8451,7 +8466,7 @@
       </w:r>
       <w:proofErr w:type="spellEnd"/>
       <w:r>
-        <w:t xml:space="preserve"> » qui sont apparent mais non, utiliser, c’est normal car </w:t>
+        <w:t xml:space="preserve"> » qui sont apparent mais non utiliser, c’est normal car </w:t>
       </w:r>
       <w:r>
         <w:t>à</w:t>
@@ -8464,7 +8479,7 @@
       <w:pPr>
         <w:pStyle w:val="Titre3"/>
       </w:pPr>
-      <w:bookmarkStart w:id="38" w:name="_Toc232347048"/>
+      <w:bookmarkStart w:id="38" w:name="_Toc232353187"/>
       <w:r>
         <w:t xml:space="preserve">Explication du banc de test du </w:t>
       </w:r>
@@ -8620,7 +8635,7 @@
       <w:pPr>
         <w:pStyle w:val="Titre3"/>
       </w:pPr>
-      <w:bookmarkStart w:id="39" w:name="_Toc232347049"/>
+      <w:bookmarkStart w:id="39" w:name="_Toc232353188"/>
       <w:r>
         <w:lastRenderedPageBreak/>
         <w:t xml:space="preserve">Résultat de la simulation du </w:t>
@@ -8754,7 +8769,7 @@
       <w:pPr>
         <w:pStyle w:val="Lgende"/>
       </w:pPr>
-      <w:bookmarkStart w:id="40" w:name="_Toc232347081"/>
+      <w:bookmarkStart w:id="40" w:name="_Toc232353220"/>
       <w:r>
         <w:t xml:space="preserve">Figure </w:t>
       </w:r>
@@ -8792,30 +8807,294 @@
       <w:bookmarkEnd w:id="40"/>
       <w:proofErr w:type="spellEnd"/>
     </w:p>
+    <w:p>
+      <w:pPr>
+        <w:pStyle w:val="Titre2"/>
+      </w:pPr>
+      <w:bookmarkStart w:id="41" w:name="_Toc232353189"/>
+      <w:r>
+        <w:t>Registre de commande 32bits</w:t>
+      </w:r>
+      <w:bookmarkEnd w:id="41"/>
+    </w:p>
+    <w:p>
+      <w:r>
+        <w:t xml:space="preserve">Pour des raisons de simplification du code, j'ai décidé d'intégrer le registre de commande sur 32 bits directement au sein </w:t>
+      </w:r>
+      <w:r>
+        <w:t xml:space="preserve">du </w:t>
+      </w:r>
+      <w:proofErr w:type="spellStart"/>
+      <w:r>
+        <w:rPr>
+          <w:b/>
+          <w:bCs/>
+          <w:i/>
+          <w:iCs/>
+        </w:rPr>
+        <w:t>d</w:t>
+      </w:r>
+      <w:r>
+        <w:rPr>
+          <w:b/>
+          <w:bCs/>
+          <w:i/>
+          <w:iCs/>
+        </w:rPr>
+        <w:t>atapath</w:t>
+      </w:r>
+      <w:r>
+        <w:rPr>
+          <w:b/>
+          <w:bCs/>
+          <w:i/>
+          <w:iCs/>
+        </w:rPr>
+        <w:t>.vhd</w:t>
+      </w:r>
+      <w:proofErr w:type="spellEnd"/>
+      <w:r>
+        <w:t>. En effet, je ne souhaitais pas créer de fils (</w:t>
+      </w:r>
+      <w:proofErr w:type="spellStart"/>
+      <w:r>
+        <w:t>signals</w:t>
+      </w:r>
+      <w:proofErr w:type="spellEnd"/>
+      <w:r>
+        <w:t>) supplémentaires ni ajouter une nouvelle instanciation de composant dans mon architecture.</w:t>
+      </w:r>
+    </w:p>
+    <w:p>
+      <w:r>
+        <w:t xml:space="preserve">Bien que ce choix puisse potentiellement avoir des répercussions ou des impacts structurels ailleurs dans le processeur, je trouve que le faire de cette manière rend le système beaucoup plus clair. Cela m'offre une bien meilleure lisibilité globale du code et me permet de mieux visualiser le comportement et le flux des données lors des phases de routage et de simulation. </w:t>
+      </w:r>
+    </w:p>
     <w:p/>
     <w:p>
+      <w:r>
+        <w:t xml:space="preserve">Le fichier </w:t>
+      </w:r>
+      <w:proofErr w:type="spellStart"/>
+      <w:r>
+        <w:rPr>
+          <w:b/>
+          <w:bCs/>
+          <w:i/>
+          <w:iCs/>
+        </w:rPr>
+        <w:t>tb_</w:t>
+      </w:r>
+      <w:r>
+        <w:rPr>
+          <w:b/>
+          <w:bCs/>
+          <w:i/>
+          <w:iCs/>
+        </w:rPr>
+        <w:t>ref_aff</w:t>
+      </w:r>
+      <w:r>
+        <w:rPr>
+          <w:b/>
+          <w:bCs/>
+          <w:i/>
+          <w:iCs/>
+        </w:rPr>
+        <w:t>.vhd</w:t>
+      </w:r>
+      <w:proofErr w:type="spellEnd"/>
+      <w:r>
+        <w:t xml:space="preserve"> permet</w:t>
+      </w:r>
+      <w:r>
+        <w:t xml:space="preserve"> de vérifier le comportement </w:t>
+      </w:r>
+      <w:r>
+        <w:t xml:space="preserve">dans le </w:t>
+      </w:r>
+      <w:proofErr w:type="spellStart"/>
+      <w:r>
+        <w:t>datapath</w:t>
+      </w:r>
+      <w:proofErr w:type="spellEnd"/>
+      <w:r>
+        <w:t>.</w:t>
+      </w:r>
+    </w:p>
+    <w:p>
+      <w:r>
+        <w:t xml:space="preserve">Le script permettant de mettre en forme l’affichage et de lancer la simulation se </w:t>
+      </w:r>
+      <w:proofErr w:type="gramStart"/>
+      <w:r>
+        <w:t xml:space="preserve">nomme </w:t>
+      </w:r>
+      <w:r>
+        <w:t xml:space="preserve"> </w:t>
+      </w:r>
+      <w:r>
+        <w:rPr>
+          <w:b/>
+          <w:bCs/>
+          <w:i/>
+          <w:iCs/>
+        </w:rPr>
+        <w:t>simu</w:t>
+      </w:r>
+      <w:r>
+        <w:rPr>
+          <w:b/>
+          <w:bCs/>
+          <w:i/>
+          <w:iCs/>
+        </w:rPr>
+        <w:t>REG_AFF</w:t>
+      </w:r>
+      <w:r>
+        <w:rPr>
+          <w:b/>
+          <w:bCs/>
+          <w:i/>
+          <w:iCs/>
+        </w:rPr>
+        <w:t>.do</w:t>
+      </w:r>
+      <w:proofErr w:type="gramEnd"/>
+      <w:r>
+        <w:t>.</w:t>
+      </w:r>
+    </w:p>
+    <w:p>
+      <w:r>
+        <w:t xml:space="preserve">On observe d’après la figure ci-dessous extraite de </w:t>
+      </w:r>
+      <w:proofErr w:type="spellStart"/>
+      <w:r>
+        <w:t>ModelSim</w:t>
+      </w:r>
+      <w:proofErr w:type="spellEnd"/>
+      <w:r>
+        <w:t>, le bon fonctionnement de notre registre de commande de 32 bits.</w:t>
+      </w:r>
+    </w:p>
+    <w:p/>
+    <w:p/>
+    <w:p>
+      <w:pPr>
+        <w:keepNext/>
+      </w:pPr>
+      <w:r>
+        <w:lastRenderedPageBreak/>
+        <w:drawing>
+          <wp:inline distT="0" distB="0" distL="0" distR="0" wp14:anchorId="43D1880B" wp14:editId="2B6C4040">
+            <wp:extent cx="5760720" cy="2430780"/>
+            <wp:effectExtent l="19050" t="19050" r="11430" b="26670"/>
+            <wp:docPr id="7" name="Image 7"/>
+            <wp:cNvGraphicFramePr>
+              <a:graphicFrameLocks xmlns:a="http://schemas.openxmlformats.org/drawingml/2006/main" noChangeAspect="1"/>
+            </wp:cNvGraphicFramePr>
+            <a:graphic xmlns:a="http://schemas.openxmlformats.org/drawingml/2006/main">
+              <a:graphicData uri="http://schemas.openxmlformats.org/drawingml/2006/picture">
+                <pic:pic xmlns:pic="http://schemas.openxmlformats.org/drawingml/2006/picture">
+                  <pic:nvPicPr>
+                    <pic:cNvPr id="1" name=""/>
+                    <pic:cNvPicPr/>
+                  </pic:nvPicPr>
+                  <pic:blipFill>
+                    <a:blip r:embed="rId23"/>
+                    <a:stretch>
+                      <a:fillRect/>
+                    </a:stretch>
+                  </pic:blipFill>
+                  <pic:spPr>
+                    <a:xfrm>
+                      <a:off x="0" y="0"/>
+                      <a:ext cx="5760720" cy="2430780"/>
+                    </a:xfrm>
+                    <a:prstGeom prst="roundRect">
+                      <a:avLst/>
+                    </a:prstGeom>
+                    <a:ln>
+                      <a:solidFill>
+                        <a:schemeClr val="bg1">
+                          <a:lumMod val="85000"/>
+                        </a:schemeClr>
+                      </a:solidFill>
+                    </a:ln>
+                  </pic:spPr>
+                </pic:pic>
+              </a:graphicData>
+            </a:graphic>
+          </wp:inline>
+        </w:drawing>
+      </w:r>
+    </w:p>
+    <w:p>
+      <w:pPr>
+        <w:pStyle w:val="Lgende"/>
+      </w:pPr>
+      <w:bookmarkStart w:id="42" w:name="_Toc232353221"/>
+      <w:r>
+        <w:t xml:space="preserve">Figure </w:t>
+      </w:r>
+      <w:r>
+        <w:fldChar w:fldCharType="begin"/>
+      </w:r>
+      <w:r>
+        <w:instrText xml:space="preserve"> SEQ Figure \* ARABIC </w:instrText>
+      </w:r>
+      <w:r>
+        <w:fldChar w:fldCharType="separate"/>
+      </w:r>
+      <w:r>
+        <w:rPr>
+          <w:noProof/>
+        </w:rPr>
+        <w:t>15</w:t>
+      </w:r>
+      <w:r>
+        <w:fldChar w:fldCharType="end"/>
+      </w:r>
+      <w:r>
+        <w:t xml:space="preserve"> : </w:t>
+      </w:r>
+      <w:r>
+        <w:t>Simulation d</w:t>
+      </w:r>
+      <w:r>
+        <w:t xml:space="preserve">u registre de commande 32 bits dans le </w:t>
+      </w:r>
+      <w:proofErr w:type="spellStart"/>
+      <w:r>
+        <w:t>datapath</w:t>
+      </w:r>
+      <w:bookmarkEnd w:id="42"/>
+      <w:proofErr w:type="spellEnd"/>
+    </w:p>
+    <w:p/>
+    <w:p>
       <w:pPr>
         <w:pStyle w:val="Titre2"/>
       </w:pPr>
-      <w:bookmarkStart w:id="41" w:name="_Toc232347050"/>
+      <w:bookmarkStart w:id="43" w:name="_Toc232353190"/>
       <w:r>
         <w:t>Unité de gestion d’instruction</w:t>
       </w:r>
-      <w:bookmarkEnd w:id="41"/>
+      <w:bookmarkEnd w:id="43"/>
       <w:r>
         <w:t xml:space="preserve"> </w:t>
       </w:r>
     </w:p>
-    <w:p/>
     <w:p>
       <w:pPr>
         <w:pStyle w:val="Titre3"/>
       </w:pPr>
-      <w:bookmarkStart w:id="42" w:name="_Toc232347051"/>
+      <w:bookmarkStart w:id="44" w:name="_Toc232353191"/>
       <w:r>
         <w:t>Explication du code de l’Unité de Gestion d’Instruction</w:t>
       </w:r>
-      <w:bookmarkEnd w:id="42"/>
+      <w:bookmarkEnd w:id="44"/>
     </w:p>
     <w:p>
       <w:r>
@@ -8918,11 +9197,7 @@
         <w:t> »</w:t>
       </w:r>
       <w:r>
-        <w:t xml:space="preserve"> = '1', le processeur exécute une instruction de branchement. Dans ce cas, l’adresse suivante est calculée à partir de l’offset contenu dans l’instruction. Pour les </w:t>
-      </w:r>
-      <w:r>
-        <w:lastRenderedPageBreak/>
-        <w:t>offsets négatifs, une logique spécifique permet de revenir vers certaines parties du programme, notamment pour réaliser des boucles. Pour les offsets positifs, l’adresse suivante est calculée en ajoutant l’offset étendu à la valeur actuelle du compteur de programme.</w:t>
+        <w:t xml:space="preserve"> = '1', le processeur exécute une instruction de branchement. Dans ce cas, l’adresse suivante est calculée à partir de l’offset contenu dans l’instruction. Pour les offsets négatifs, une logique spécifique permet de revenir vers certaines parties du programme, notamment pour réaliser des boucles. Pour les offsets positifs, l’adresse suivante est calculée en ajoutant l’offset étendu à la valeur actuelle du compteur de programme.</w:t>
       </w:r>
     </w:p>
     <w:p/>
@@ -8951,7 +9226,7 @@
                     <pic:cNvPicPr/>
                   </pic:nvPicPr>
                   <pic:blipFill>
-                    <a:blip r:embed="rId23"/>
+                    <a:blip r:embed="rId24"/>
                     <a:stretch>
                       <a:fillRect/>
                     </a:stretch>
@@ -8983,7 +9258,7 @@
       <w:pPr>
         <w:pStyle w:val="Lgende"/>
       </w:pPr>
-      <w:bookmarkStart w:id="43" w:name="_Toc232347082"/>
+      <w:bookmarkStart w:id="45" w:name="_Toc232353222"/>
       <w:r>
         <w:t xml:space="preserve">Figure </w:t>
       </w:r>
@@ -9000,7 +9275,7 @@
         <w:rPr>
           <w:noProof/>
         </w:rPr>
-        <w:t>15</w:t>
+        <w:t>16</w:t>
       </w:r>
       <w:r>
         <w:fldChar w:fldCharType="end"/>
@@ -9014,7 +9289,7 @@
       <w:r>
         <w:t>e l'Unité de Gestion d'Instruction</w:t>
       </w:r>
-      <w:bookmarkEnd w:id="43"/>
+      <w:bookmarkEnd w:id="45"/>
     </w:p>
     <w:p/>
     <w:p>
@@ -9024,7 +9299,7 @@
           <w:rStyle w:val="Titre3Car"/>
         </w:rPr>
       </w:pPr>
-      <w:bookmarkStart w:id="44" w:name="_Toc232347052"/>
+      <w:bookmarkStart w:id="46" w:name="_Toc232353192"/>
       <w:r>
         <w:t>E</w:t>
       </w:r>
@@ -9034,7 +9309,7 @@
         </w:rPr>
         <w:t>xplication du banc de test de l’Unité de Gestion d’Instruction</w:t>
       </w:r>
-      <w:bookmarkEnd w:id="44"/>
+      <w:bookmarkEnd w:id="46"/>
     </w:p>
     <w:p>
       <w:r>
@@ -9186,11 +9461,11 @@
       <w:pPr>
         <w:pStyle w:val="Titre3"/>
       </w:pPr>
-      <w:bookmarkStart w:id="45" w:name="_Toc232347053"/>
+      <w:bookmarkStart w:id="47" w:name="_Toc232353193"/>
       <w:r>
         <w:t>Résultat de la simulation de l’Unité de Gestion d’Instruction</w:t>
       </w:r>
-      <w:bookmarkEnd w:id="45"/>
+      <w:bookmarkEnd w:id="47"/>
     </w:p>
     <w:p>
       <w:r>
@@ -9211,7 +9486,6 @@
     </w:p>
     <w:p>
       <w:r>
-        <w:lastRenderedPageBreak/>
         <w:t xml:space="preserve">La figure ci-dessous issue de </w:t>
       </w:r>
       <w:proofErr w:type="spellStart"/>
@@ -9268,7 +9542,11 @@
       </w:r>
       <w:proofErr w:type="spellEnd"/>
       <w:r>
-        <w:t xml:space="preserve"> est réinitialisé à 00000000. La mémoire d’instructions fournit alors immédiatement l’instruction située à cette adresse, soit E3A01010. Dans le même temps, le signal </w:t>
+        <w:t xml:space="preserve"> est réinitialisé à 00000000. La mémoire d’instructions fournit alors </w:t>
+      </w:r>
+      <w:r>
+        <w:lastRenderedPageBreak/>
+        <w:t xml:space="preserve">immédiatement l’instruction située à cette adresse, soit E3A01010. Dans le même temps, le signal </w:t>
       </w:r>
       <w:proofErr w:type="spellStart"/>
       <w:r>
@@ -9547,7 +9825,6 @@
         <w:ind w:left="708"/>
       </w:pPr>
       <w:r>
-        <w:lastRenderedPageBreak/>
         <w:t xml:space="preserve">Au front d’horloge de 65 ns, le compteur revient au début du programme. Le registre </w:t>
       </w:r>
       <w:proofErr w:type="spellStart"/>
@@ -9579,6 +9856,7 @@
         <w:rPr>
           <w:noProof/>
         </w:rPr>
+        <w:lastRenderedPageBreak/>
         <w:drawing>
           <wp:inline distT="0" distB="0" distL="0" distR="0" wp14:anchorId="01F96F20" wp14:editId="1880CD16">
             <wp:extent cx="5760720" cy="1716405"/>
@@ -9595,7 +9873,7 @@
                     <pic:cNvPicPr/>
                   </pic:nvPicPr>
                   <pic:blipFill>
-                    <a:blip r:embed="rId24"/>
+                    <a:blip r:embed="rId25"/>
                     <a:stretch>
                       <a:fillRect/>
                     </a:stretch>
@@ -9627,7 +9905,7 @@
       <w:pPr>
         <w:pStyle w:val="Lgende"/>
       </w:pPr>
-      <w:bookmarkStart w:id="46" w:name="_Toc232347083"/>
+      <w:bookmarkStart w:id="48" w:name="_Toc232353223"/>
       <w:r>
         <w:t xml:space="preserve">Figure </w:t>
       </w:r>
@@ -9644,7 +9922,7 @@
         <w:rPr>
           <w:noProof/>
         </w:rPr>
-        <w:t>16</w:t>
+        <w:t>17</w:t>
       </w:r>
       <w:r>
         <w:fldChar w:fldCharType="end"/>
@@ -9652,7 +9930,7 @@
       <w:r>
         <w:t xml:space="preserve"> : Résultat de la simulation de l'Unité de Gestion d'Instruction</w:t>
       </w:r>
-      <w:bookmarkEnd w:id="46"/>
+      <w:bookmarkEnd w:id="48"/>
     </w:p>
     <w:p>
       <w:pPr>
@@ -9664,21 +9942,21 @@
       <w:pPr>
         <w:pStyle w:val="Titre2"/>
       </w:pPr>
-      <w:bookmarkStart w:id="47" w:name="_Toc232347054"/>
+      <w:bookmarkStart w:id="49" w:name="_Toc232353194"/>
       <w:r>
         <w:t>Décodeur</w:t>
       </w:r>
-      <w:bookmarkEnd w:id="47"/>
+      <w:bookmarkEnd w:id="49"/>
     </w:p>
     <w:p>
       <w:pPr>
         <w:pStyle w:val="Titre3"/>
       </w:pPr>
-      <w:bookmarkStart w:id="48" w:name="_Toc232347055"/>
+      <w:bookmarkStart w:id="50" w:name="_Toc232353195"/>
       <w:r>
         <w:t>Explication du code du décodeur</w:t>
       </w:r>
-      <w:bookmarkEnd w:id="48"/>
+      <w:bookmarkEnd w:id="50"/>
     </w:p>
     <w:p>
       <w:r>
@@ -9812,7 +10090,6 @@
       <w:proofErr w:type="spellStart"/>
       <w:proofErr w:type="gramStart"/>
       <w:r>
-        <w:lastRenderedPageBreak/>
         <w:t>flag</w:t>
       </w:r>
       <w:proofErr w:type="gramEnd"/>
@@ -9838,6 +10115,10 @@
         <w:jc w:val="center"/>
       </w:pPr>
       <w:r>
+        <w:rPr>
+          <w:noProof/>
+        </w:rPr>
+        <w:lastRenderedPageBreak/>
         <w:drawing>
           <wp:inline distT="0" distB="0" distL="0" distR="0" wp14:anchorId="3F4B9236" wp14:editId="12D24DE1">
             <wp:extent cx="5760720" cy="2599690"/>
@@ -9854,7 +10135,7 @@
                     <pic:cNvPicPr/>
                   </pic:nvPicPr>
                   <pic:blipFill>
-                    <a:blip r:embed="rId25"/>
+                    <a:blip r:embed="rId26"/>
                     <a:stretch>
                       <a:fillRect/>
                     </a:stretch>
@@ -9886,7 +10167,7 @@
       <w:pPr>
         <w:pStyle w:val="Lgende"/>
       </w:pPr>
-      <w:bookmarkStart w:id="49" w:name="_Toc232347084"/>
+      <w:bookmarkStart w:id="51" w:name="_Toc232353224"/>
       <w:r>
         <w:t xml:space="preserve">Figure </w:t>
       </w:r>
@@ -9903,7 +10184,7 @@
         <w:rPr>
           <w:noProof/>
         </w:rPr>
-        <w:t>17</w:t>
+        <w:t>18</w:t>
       </w:r>
       <w:r>
         <w:fldChar w:fldCharType="end"/>
@@ -9911,20 +10192,114 @@
       <w:r>
         <w:t xml:space="preserve"> : Représentation graphique du Décodeur</w:t>
       </w:r>
-      <w:bookmarkEnd w:id="49"/>
+      <w:bookmarkEnd w:id="51"/>
     </w:p>
     <w:p>
       <w:pPr>
         <w:pStyle w:val="Titre4"/>
       </w:pPr>
-      <w:bookmarkStart w:id="50" w:name="_Toc232347056"/>
+      <w:bookmarkStart w:id="52" w:name="_Toc232353196"/>
       <w:r>
         <w:t>Valeur des commandes</w:t>
       </w:r>
-      <w:bookmarkEnd w:id="50"/>
+      <w:bookmarkEnd w:id="52"/>
       <w:r>
         <w:t xml:space="preserve"> </w:t>
       </w:r>
+    </w:p>
+    <w:p>
+      <w:r>
+        <w:t xml:space="preserve">Voici les valeurs de commandes que j’ai trouvé, sachant que le « – </w:t>
+      </w:r>
+      <w:proofErr w:type="gramStart"/>
+      <w:r>
+        <w:t>»  signifie</w:t>
+      </w:r>
+      <w:proofErr w:type="gramEnd"/>
+      <w:r>
+        <w:t xml:space="preserve"> peut importe</w:t>
+      </w:r>
+    </w:p>
+    <w:p>
+      <w:pPr>
+        <w:keepNext/>
+        <w:jc w:val="center"/>
+      </w:pPr>
+      <w:r>
+        <w:drawing>
+          <wp:inline distT="0" distB="0" distL="0" distR="0" wp14:anchorId="1935CC2E" wp14:editId="5CB9BBE8">
+            <wp:extent cx="5760720" cy="1929130"/>
+            <wp:effectExtent l="19050" t="19050" r="11430" b="13970"/>
+            <wp:docPr id="12" name="Image 12"/>
+            <wp:cNvGraphicFramePr>
+              <a:graphicFrameLocks xmlns:a="http://schemas.openxmlformats.org/drawingml/2006/main" noChangeAspect="1"/>
+            </wp:cNvGraphicFramePr>
+            <a:graphic xmlns:a="http://schemas.openxmlformats.org/drawingml/2006/main">
+              <a:graphicData uri="http://schemas.openxmlformats.org/drawingml/2006/picture">
+                <pic:pic xmlns:pic="http://schemas.openxmlformats.org/drawingml/2006/picture">
+                  <pic:nvPicPr>
+                    <pic:cNvPr id="1" name=""/>
+                    <pic:cNvPicPr/>
+                  </pic:nvPicPr>
+                  <pic:blipFill>
+                    <a:blip r:embed="rId27"/>
+                    <a:stretch>
+                      <a:fillRect/>
+                    </a:stretch>
+                  </pic:blipFill>
+                  <pic:spPr>
+                    <a:xfrm>
+                      <a:off x="0" y="0"/>
+                      <a:ext cx="5760720" cy="1929130"/>
+                    </a:xfrm>
+                    <a:prstGeom prst="roundRect">
+                      <a:avLst/>
+                    </a:prstGeom>
+                    <a:ln>
+                      <a:solidFill>
+                        <a:schemeClr val="bg1">
+                          <a:lumMod val="85000"/>
+                        </a:schemeClr>
+                      </a:solidFill>
+                    </a:ln>
+                  </pic:spPr>
+                </pic:pic>
+              </a:graphicData>
+            </a:graphic>
+          </wp:inline>
+        </w:drawing>
+      </w:r>
+    </w:p>
+    <w:p>
+      <w:pPr>
+        <w:pStyle w:val="Lgende"/>
+      </w:pPr>
+      <w:bookmarkStart w:id="53" w:name="_Toc232353225"/>
+      <w:r>
+        <w:t xml:space="preserve">Figure </w:t>
+      </w:r>
+      <w:r>
+        <w:fldChar w:fldCharType="begin"/>
+      </w:r>
+      <w:r>
+        <w:instrText xml:space="preserve"> SEQ Figure \* ARABIC </w:instrText>
+      </w:r>
+      <w:r>
+        <w:fldChar w:fldCharType="separate"/>
+      </w:r>
+      <w:r>
+        <w:rPr>
+          <w:noProof/>
+        </w:rPr>
+        <w:t>19</w:t>
+      </w:r>
+      <w:r>
+        <w:fldChar w:fldCharType="end"/>
+      </w:r>
+      <w:r>
+        <w:t xml:space="preserve"> : Valeur des commandes</w:t>
+      </w:r>
+      <w:bookmarkEnd w:id="53"/>
     </w:p>
     <w:p>
       <w:pPr>
@@ -9933,7 +10308,7 @@
           <w:rStyle w:val="Titre3Car"/>
         </w:rPr>
       </w:pPr>
-      <w:bookmarkStart w:id="51" w:name="_Toc232347057"/>
+      <w:bookmarkStart w:id="54" w:name="_Toc232353197"/>
       <w:r>
         <w:t>E</w:t>
       </w:r>
@@ -9943,7 +10318,7 @@
         </w:rPr>
         <w:t>xplication du banc de test de l’Unité de Gestion d’Instruction</w:t>
       </w:r>
-      <w:bookmarkEnd w:id="51"/>
+      <w:bookmarkEnd w:id="54"/>
     </w:p>
     <w:p>
       <w:r>
@@ -10059,7 +10434,11 @@
         <w:t>Les branchements :</w:t>
       </w:r>
       <w:r>
-        <w:t xml:space="preserve"> Test du saut inconditionnel (BAL) et du saut conditionnel (BLT). Pour ce dernier, le banc de test applique une double vérification cruciale : il injecte la même instruction à deux instants différents en modifiant uniquement le vecteur de drapeaux (</w:t>
+        <w:t xml:space="preserve"> Test du saut inconditionnel (BAL) et du saut conditionnel (BLT). Pour ce dernier, le banc de test applique une double vérification cruciale : il injecte la même instruction à deux instants différents en modifiant uniquement le vecteur de drapeaux </w:t>
+      </w:r>
+      <w:r>
+        <w:lastRenderedPageBreak/>
+        <w:t>(</w:t>
       </w:r>
       <w:proofErr w:type="spellStart"/>
       <w:r>
@@ -10126,15 +10505,14 @@
       <w:pPr>
         <w:pStyle w:val="Titre3"/>
       </w:pPr>
-      <w:bookmarkStart w:id="52" w:name="_Toc232347058"/>
-      <w:r>
-        <w:lastRenderedPageBreak/>
+      <w:bookmarkStart w:id="55" w:name="_Toc232353198"/>
+      <w:r>
         <w:t>Résultat de la simulation de l’Unité de Gestion</w:t>
       </w:r>
       <w:r>
         <w:t xml:space="preserve"> d’Instruction</w:t>
       </w:r>
-      <w:bookmarkEnd w:id="52"/>
+      <w:bookmarkEnd w:id="55"/>
     </w:p>
     <w:p>
       <w:r>
@@ -10205,13 +10583,7 @@
         </w:numPr>
       </w:pPr>
       <w:r>
-        <w:t>10 ns à 30 ns – Instruction MOV R1, #0x10 (Opcode : E3A01010)</w:t>
-      </w:r>
-      <w:r>
-        <w:t xml:space="preserve"> : </w:t>
-      </w:r>
-      <w:r>
-        <w:t xml:space="preserve">Le décodeur reconnaît une instruction MOV. L'écriture dans le banc de registres est activée (« </w:t>
+        <w:t xml:space="preserve">10 ns à 30 ns – Instruction MOV R1, #0x10 (Opcode : E3A01010) : Le décodeur reconnaît une instruction MOV. L'écriture dans le banc de registres est activée (« </w:t>
       </w:r>
       <w:proofErr w:type="spellStart"/>
       <w:r>
@@ -10255,13 +10627,7 @@
         </w:numPr>
       </w:pPr>
       <w:r>
-        <w:t>30 ns à 50 ns – Instruction MOV R2, #0 (Opcode : E3A02000)</w:t>
-      </w:r>
-      <w:r>
-        <w:t xml:space="preserve"> : </w:t>
-      </w:r>
-      <w:r>
-        <w:t xml:space="preserve">Cette instruction produit le même comportement que la précédente. Les signaux « </w:t>
+        <w:t xml:space="preserve">30 ns à 50 ns – Instruction MOV R2, #0 (Opcode : E3A02000) : Cette instruction produit le même comportement que la précédente. Les signaux « </w:t>
       </w:r>
       <w:proofErr w:type="spellStart"/>
       <w:r>
@@ -10297,13 +10663,7 @@
         </w:numPr>
       </w:pPr>
       <w:r>
-        <w:t>50 ns à 70 ns – Instruction LDR R0, 0(R1) (Opcode : E4110000)</w:t>
-      </w:r>
-      <w:r>
-        <w:t xml:space="preserve"> : </w:t>
-      </w:r>
-      <w:r>
-        <w:t xml:space="preserve">L'instruction réalise un chargement mémoire. L'adresse est calculée par addition (« </w:t>
+        <w:t xml:space="preserve">50 ns à 70 ns – Instruction LDR R0, 0(R1) (Opcode : E4110000) : L'instruction réalise un chargement mémoire. L'adresse est calculée par addition (« </w:t>
       </w:r>
       <w:proofErr w:type="spellStart"/>
       <w:r>
@@ -10347,13 +10707,7 @@
         </w:numPr>
       </w:pPr>
       <w:r>
-        <w:t>70 ns à 90 ns – Instruction ADD R2, R2, R0 (Opcode : E0822000)</w:t>
-      </w:r>
-      <w:r>
-        <w:t xml:space="preserve"> : </w:t>
-      </w:r>
-      <w:r>
-        <w:t xml:space="preserve">L'ALU effectue une addition entre deux registres (« </w:t>
+        <w:t xml:space="preserve">70 ns à 90 ns – Instruction ADD R2, R2, R0 (Opcode : E0822000) : L'ALU effectue une addition entre deux registres (« </w:t>
       </w:r>
       <w:proofErr w:type="spellStart"/>
       <w:r>
@@ -10389,13 +10743,7 @@
         </w:numPr>
       </w:pPr>
       <w:r>
-        <w:t>90 ns à 110 ns – Instruction CMP R1, #0x1A (Opcode : E351001A)</w:t>
-      </w:r>
-      <w:r>
-        <w:t xml:space="preserve"> : </w:t>
-      </w:r>
-      <w:r>
-        <w:t xml:space="preserve">Cette comparaison met à jour les drapeaux sans modifier de registre. Le signal « </w:t>
+        <w:t xml:space="preserve">90 ns à 110 ns – Instruction CMP R1, #0x1A (Opcode : E351001A) : Cette comparaison met à jour les drapeaux sans modifier de registre. Le signal « </w:t>
       </w:r>
       <w:proofErr w:type="spellStart"/>
       <w:r>
@@ -10431,6 +10779,7 @@
         </w:numPr>
       </w:pPr>
       <w:r>
+        <w:lastRenderedPageBreak/>
         <w:t xml:space="preserve">110 ns à 130 ns – Instruction BLT </w:t>
       </w:r>
       <w:proofErr w:type="spellStart"/>
@@ -10439,13 +10788,7 @@
       </w:r>
       <w:proofErr w:type="spellEnd"/>
       <w:r>
-        <w:t xml:space="preserve"> (Opcode : BAFFFFFB), avec N = '0'</w:t>
-      </w:r>
-      <w:r>
-        <w:t xml:space="preserve"> : </w:t>
-      </w:r>
-      <w:r>
-        <w:t xml:space="preserve">La condition du branchement n'est pas satisfaite puisque le drapeau négatif est à '0'. Le signal « </w:t>
+        <w:t xml:space="preserve"> (Opcode : BAFFFFFB), avec N = '0' : La condition du branchement n'est pas satisfaite puisque le drapeau négatif est à '0'. Le signal « </w:t>
       </w:r>
       <w:proofErr w:type="spellStart"/>
       <w:r>
@@ -10473,13 +10816,7 @@
       </w:r>
       <w:proofErr w:type="spellEnd"/>
       <w:r>
-        <w:t xml:space="preserve"> (Opcode : BAFFFFFB), avec N = '1'</w:t>
-      </w:r>
-      <w:r>
-        <w:t xml:space="preserve"> : </w:t>
-      </w:r>
-      <w:r>
-        <w:t xml:space="preserve">Le drapeau négatif passe à '1', validant la condition de branchement. Le signal « </w:t>
+        <w:t xml:space="preserve"> (Opcode : BAFFFFFB), avec N = '1' : Le drapeau négatif passe à '1', validant la condition de branchement. Le signal « </w:t>
       </w:r>
       <w:proofErr w:type="spellStart"/>
       <w:r>
@@ -10499,13 +10836,7 @@
         </w:numPr>
       </w:pPr>
       <w:r>
-        <w:t>150 ns à 170 ns – Instruction STR R2, 0(R1) (Opcode : E4012000)</w:t>
-      </w:r>
-      <w:r>
-        <w:t xml:space="preserve"> : </w:t>
-      </w:r>
-      <w:r>
-        <w:t xml:space="preserve">Cette instruction écrit le contenu de R2 en mémoire. Le signal « </w:t>
+        <w:t xml:space="preserve">150 ns à 170 ns – Instruction STR R2, 0(R1) (Opcode : E4012000) : Cette instruction écrit le contenu de R2 en mémoire. Le signal « </w:t>
       </w:r>
       <w:proofErr w:type="spellStart"/>
       <w:r>
@@ -10513,11 +10844,7 @@
       </w:r>
       <w:proofErr w:type="spellEnd"/>
       <w:r>
-        <w:t xml:space="preserve"> » = '1' autorise l'écriture mémoire tandis </w:t>
-      </w:r>
-      <w:r>
-        <w:lastRenderedPageBreak/>
-        <w:t xml:space="preserve">que « </w:t>
+        <w:t xml:space="preserve"> » = '1' autorise l'écriture mémoire tandis que « </w:t>
       </w:r>
       <w:proofErr w:type="spellStart"/>
       <w:r>
@@ -10542,6 +10869,9 @@
         <w:jc w:val="center"/>
       </w:pPr>
       <w:r>
+        <w:rPr>
+          <w:noProof/>
+        </w:rPr>
         <w:drawing>
           <wp:inline distT="0" distB="0" distL="0" distR="0" wp14:anchorId="269C699F" wp14:editId="603033AE">
             <wp:extent cx="5760720" cy="1349375"/>
@@ -10558,7 +10888,7 @@
                     <pic:cNvPicPr/>
                   </pic:nvPicPr>
                   <pic:blipFill>
-                    <a:blip r:embed="rId26"/>
+                    <a:blip r:embed="rId28"/>
                     <a:stretch>
                       <a:fillRect/>
                     </a:stretch>
@@ -10593,7 +10923,7 @@
           <w:i w:val="0"/>
         </w:rPr>
       </w:pPr>
-      <w:bookmarkStart w:id="53" w:name="_Toc232347085"/>
+      <w:bookmarkStart w:id="56" w:name="_Toc232353226"/>
       <w:r>
         <w:t xml:space="preserve">Figure </w:t>
       </w:r>
@@ -10610,7 +10940,7 @@
         <w:rPr>
           <w:noProof/>
         </w:rPr>
-        <w:t>18</w:t>
+        <w:t>20</w:t>
       </w:r>
       <w:r>
         <w:fldChar w:fldCharType="end"/>
@@ -10628,7 +10958,7 @@
       <w:r>
         <w:t>Decodeur</w:t>
       </w:r>
-      <w:bookmarkEnd w:id="53"/>
+      <w:bookmarkEnd w:id="56"/>
       <w:proofErr w:type="spellEnd"/>
     </w:p>
     <w:p>
@@ -10641,18 +10971,15 @@
       <w:pPr>
         <w:pStyle w:val="Titre1"/>
       </w:pPr>
-      <w:bookmarkStart w:id="54" w:name="_Toc232347059"/>
+      <w:bookmarkStart w:id="57" w:name="_Toc232353199"/>
       <w:r>
         <w:t>Validation du processeur monocycle</w:t>
       </w:r>
-      <w:bookmarkEnd w:id="54"/>
-    </w:p>
-    <w:p>
-      <w:r>
-        <w:t xml:space="preserve">Cette étape finale concrétise le projet en interconnectant les trois entités principales au sein du module de plus haut </w:t>
-      </w:r>
-      <w:r>
-        <w:t xml:space="preserve">niveau </w:t>
+      <w:bookmarkEnd w:id="57"/>
+    </w:p>
+    <w:p>
+      <w:r>
+        <w:t xml:space="preserve">Cette étape finale concrétise le projet en interconnectant les trois entités principales au sein du module de plus haut niveau </w:t>
       </w:r>
       <w:proofErr w:type="spellStart"/>
       <w:r>
@@ -10666,10 +10993,7 @@
       </w:r>
       <w:proofErr w:type="spellEnd"/>
       <w:r>
-        <w:t xml:space="preserve"> : l’Unité</w:t>
-      </w:r>
-      <w:r>
-        <w:t xml:space="preserve"> de Gestion des Instructions, l’Unité de Traitement (</w:t>
+        <w:t xml:space="preserve"> : l’Unité de Gestion des Instructions, l’Unité de Traitement (</w:t>
       </w:r>
       <w:proofErr w:type="spellStart"/>
       <w:r>
@@ -10698,11 +11022,11 @@
       <w:pPr>
         <w:pStyle w:val="Titre2"/>
       </w:pPr>
-      <w:bookmarkStart w:id="55" w:name="_Toc232347060"/>
+      <w:bookmarkStart w:id="58" w:name="_Toc232353200"/>
       <w:r>
         <w:t>Explication du banc de test</w:t>
       </w:r>
-      <w:bookmarkEnd w:id="55"/>
+      <w:bookmarkEnd w:id="58"/>
       <w:r>
         <w:t> </w:t>
       </w:r>
@@ -10768,6 +11092,7 @@
         </w:numPr>
       </w:pPr>
       <w:r>
+        <w:lastRenderedPageBreak/>
         <w:t xml:space="preserve">Séquence de réinitialisation : le </w:t>
       </w:r>
       <w:proofErr w:type="gramStart"/>
@@ -10821,12 +11146,11 @@
       <w:pPr>
         <w:pStyle w:val="Titre2"/>
       </w:pPr>
-      <w:bookmarkStart w:id="56" w:name="_Toc232347061"/>
-      <w:r>
-        <w:lastRenderedPageBreak/>
+      <w:bookmarkStart w:id="59" w:name="_Toc232353201"/>
+      <w:r>
         <w:t>Programme exécuté par le processeur monocycle</w:t>
       </w:r>
-      <w:bookmarkEnd w:id="56"/>
+      <w:bookmarkEnd w:id="59"/>
     </w:p>
     <w:p>
       <w:pPr>
@@ -10834,6 +11158,9 @@
         <w:jc w:val="center"/>
       </w:pPr>
       <w:r>
+        <w:rPr>
+          <w:noProof/>
+        </w:rPr>
         <w:drawing>
           <wp:inline distT="0" distB="0" distL="0" distR="0" wp14:anchorId="0577C3CC" wp14:editId="4EFCA6AB">
             <wp:extent cx="5760720" cy="1410970"/>
@@ -10850,7 +11177,7 @@
                     <pic:cNvPicPr/>
                   </pic:nvPicPr>
                   <pic:blipFill>
-                    <a:blip r:embed="rId27"/>
+                    <a:blip r:embed="rId29"/>
                     <a:stretch>
                       <a:fillRect/>
                     </a:stretch>
@@ -10882,7 +11209,7 @@
       <w:pPr>
         <w:pStyle w:val="Lgende"/>
       </w:pPr>
-      <w:bookmarkStart w:id="57" w:name="_Toc232347086"/>
+      <w:bookmarkStart w:id="60" w:name="_Toc232353227"/>
       <w:r>
         <w:t xml:space="preserve">Figure </w:t>
       </w:r>
@@ -10899,7 +11226,7 @@
         <w:rPr>
           <w:noProof/>
         </w:rPr>
-        <w:t>19</w:t>
+        <w:t>21</w:t>
       </w:r>
       <w:r>
         <w:fldChar w:fldCharType="end"/>
@@ -10907,7 +11234,7 @@
       <w:r>
         <w:t xml:space="preserve"> : Programme exécuté par le processeur monocycle</w:t>
       </w:r>
-      <w:bookmarkEnd w:id="57"/>
+      <w:bookmarkEnd w:id="60"/>
     </w:p>
     <w:p>
       <w:pPr>
@@ -11002,11 +11329,11 @@
       <w:pPr>
         <w:pStyle w:val="Titre2"/>
       </w:pPr>
-      <w:bookmarkStart w:id="58" w:name="_Toc232347062"/>
+      <w:bookmarkStart w:id="61" w:name="_Toc232353202"/>
       <w:r>
         <w:t>Analyse de la simulation</w:t>
       </w:r>
-      <w:bookmarkEnd w:id="58"/>
+      <w:bookmarkEnd w:id="61"/>
       <w:r>
         <w:t xml:space="preserve"> </w:t>
       </w:r>
@@ -11049,6 +11376,7 @@
         </w:numPr>
       </w:pPr>
       <w:r>
+        <w:lastRenderedPageBreak/>
         <w:t>Le registre R1 (Pointeur) commence sa course à 0x00000010 et s'incrémente d'une unité à chaque passage dans la boucle (instruction à l'adresse 0x4).</w:t>
       </w:r>
     </w:p>
@@ -11073,15 +11401,11 @@
         </w:numPr>
       </w:pPr>
       <w:r>
-        <w:t>Le registre R2</w:t>
-      </w:r>
-      <w:r>
-        <w:t xml:space="preserve"> (Accumulateur) totalise les valeurs lues. Après le premier cycle, il accueille la valeur 0xFF (255), puis croît successivement au rythme des additions successives.</w:t>
-      </w:r>
-    </w:p>
-    <w:p>
-      <w:r>
-        <w:lastRenderedPageBreak/>
+        <w:t>Le registre R2 (Accumulateur) totalise les valeurs lues. Après le premier cycle, il accueille la valeur 0xFF (255), puis croît successivement au rythme des additions successives.</w:t>
+      </w:r>
+    </w:p>
+    <w:p>
+      <w:r>
         <w:t>Concernant l</w:t>
       </w:r>
       <w:r>
@@ -11169,6 +11493,9 @@
         <w:jc w:val="center"/>
       </w:pPr>
       <w:r>
+        <w:rPr>
+          <w:noProof/>
+        </w:rPr>
         <w:lastRenderedPageBreak/>
         <w:drawing>
           <wp:inline distT="0" distB="0" distL="0" distR="0" wp14:anchorId="39D310C1" wp14:editId="700EB257">
@@ -11186,7 +11513,7 @@
                     <pic:cNvPicPr/>
                   </pic:nvPicPr>
                   <pic:blipFill>
-                    <a:blip r:embed="rId28"/>
+                    <a:blip r:embed="rId30"/>
                     <a:stretch>
                       <a:fillRect/>
                     </a:stretch>
@@ -11211,7 +11538,7 @@
       <w:pPr>
         <w:pStyle w:val="Lgende"/>
       </w:pPr>
-      <w:bookmarkStart w:id="59" w:name="_Toc232347087"/>
+      <w:bookmarkStart w:id="62" w:name="_Toc232353228"/>
       <w:r>
         <w:t xml:space="preserve">Figure </w:t>
       </w:r>
@@ -11228,7 +11555,7 @@
         <w:rPr>
           <w:noProof/>
         </w:rPr>
-        <w:t>20</w:t>
+        <w:t>22</w:t>
       </w:r>
       <w:r>
         <w:fldChar w:fldCharType="end"/>
@@ -11236,7 +11563,7 @@
       <w:r>
         <w:t xml:space="preserve"> : Résultat de la simulation du monocycle</w:t>
       </w:r>
-      <w:bookmarkEnd w:id="59"/>
+      <w:bookmarkEnd w:id="62"/>
     </w:p>
     <w:p/>
     <w:p/>
@@ -11265,11 +11592,11 @@
       <w:pPr>
         <w:pStyle w:val="Titre1"/>
       </w:pPr>
-      <w:bookmarkStart w:id="60" w:name="_Toc232347063"/>
+      <w:bookmarkStart w:id="63" w:name="_Toc232353203"/>
       <w:r>
         <w:t>Quartus prime</w:t>
       </w:r>
-      <w:bookmarkEnd w:id="60"/>
+      <w:bookmarkEnd w:id="63"/>
     </w:p>
     <w:p>
       <w:r>
@@ -11323,6 +11650,9 @@
         <w:jc w:val="center"/>
       </w:pPr>
       <w:r>
+        <w:rPr>
+          <w:noProof/>
+        </w:rPr>
         <w:drawing>
           <wp:inline distT="0" distB="0" distL="0" distR="0" wp14:anchorId="6115E58D" wp14:editId="76FADE09">
             <wp:extent cx="5760720" cy="2943860"/>
@@ -11339,7 +11669,7 @@
                     <pic:cNvPicPr/>
                   </pic:nvPicPr>
                   <pic:blipFill>
-                    <a:blip r:embed="rId29"/>
+                    <a:blip r:embed="rId31"/>
                     <a:stretch>
                       <a:fillRect/>
                     </a:stretch>
@@ -11371,7 +11701,7 @@
       <w:pPr>
         <w:pStyle w:val="Lgende"/>
       </w:pPr>
-      <w:bookmarkStart w:id="61" w:name="_Toc232347088"/>
+      <w:bookmarkStart w:id="64" w:name="_Toc232353229"/>
       <w:r>
         <w:t xml:space="preserve">Figure </w:t>
       </w:r>
@@ -11388,7 +11718,7 @@
         <w:rPr>
           <w:noProof/>
         </w:rPr>
-        <w:t>21</w:t>
+        <w:t>23</w:t>
       </w:r>
       <w:r>
         <w:fldChar w:fldCharType="end"/>
@@ -11396,7 +11726,7 @@
       <w:r>
         <w:t xml:space="preserve"> : Pin planner du monocycle</w:t>
       </w:r>
-      <w:bookmarkEnd w:id="61"/>
+      <w:bookmarkEnd w:id="64"/>
     </w:p>
     <w:p/>
     <w:p>
@@ -11418,12 +11748,12 @@
       <w:pPr>
         <w:pStyle w:val="Titre2"/>
       </w:pPr>
-      <w:bookmarkStart w:id="62" w:name="_Toc232347064"/>
+      <w:bookmarkStart w:id="65" w:name="_Toc232353204"/>
       <w:r>
         <w:lastRenderedPageBreak/>
         <w:t>Preuve de fonctionnement sur FPGA</w:t>
       </w:r>
-      <w:bookmarkEnd w:id="62"/>
+      <w:bookmarkEnd w:id="65"/>
       <w:r>
         <w:t xml:space="preserve"> </w:t>
       </w:r>
@@ -11439,6 +11769,9 @@
         <w:jc w:val="center"/>
       </w:pPr>
       <w:r>
+        <w:rPr>
+          <w:noProof/>
+        </w:rPr>
         <w:drawing>
           <wp:inline distT="0" distB="0" distL="0" distR="0" wp14:anchorId="2F6F66E5" wp14:editId="2F245FFF">
             <wp:extent cx="5760720" cy="2329180"/>
@@ -11455,7 +11788,7 @@
                     <pic:cNvPicPr/>
                   </pic:nvPicPr>
                   <pic:blipFill>
-                    <a:blip r:embed="rId30"/>
+                    <a:blip r:embed="rId32"/>
                     <a:stretch>
                       <a:fillRect/>
                     </a:stretch>
@@ -11487,7 +11820,7 @@
       <w:pPr>
         <w:pStyle w:val="Lgende"/>
       </w:pPr>
-      <w:bookmarkStart w:id="63" w:name="_Toc232347089"/>
+      <w:bookmarkStart w:id="66" w:name="_Toc232353230"/>
       <w:r>
         <w:t xml:space="preserve">Figure </w:t>
       </w:r>
@@ -11504,7 +11837,7 @@
         <w:rPr>
           <w:noProof/>
         </w:rPr>
-        <w:t>22</w:t>
+        <w:t>24</w:t>
       </w:r>
       <w:r>
         <w:fldChar w:fldCharType="end"/>
@@ -11512,7 +11845,7 @@
       <w:r>
         <w:t xml:space="preserve"> : Preuve de fonctionnement numéro 1</w:t>
       </w:r>
-      <w:bookmarkEnd w:id="63"/>
+      <w:bookmarkEnd w:id="66"/>
     </w:p>
     <w:p>
       <w:r>
@@ -11525,6 +11858,9 @@
         <w:jc w:val="center"/>
       </w:pPr>
       <w:r>
+        <w:rPr>
+          <w:noProof/>
+        </w:rPr>
         <w:drawing>
           <wp:inline distT="0" distB="0" distL="0" distR="0" wp14:anchorId="5CF702E6" wp14:editId="578F927A">
             <wp:extent cx="5760720" cy="2315210"/>
@@ -11541,7 +11877,7 @@
                     <pic:cNvPicPr/>
                   </pic:nvPicPr>
                   <pic:blipFill>
-                    <a:blip r:embed="rId31"/>
+                    <a:blip r:embed="rId33"/>
                     <a:stretch>
                       <a:fillRect/>
                     </a:stretch>
@@ -11573,7 +11909,7 @@
       <w:pPr>
         <w:pStyle w:val="Lgende"/>
       </w:pPr>
-      <w:bookmarkStart w:id="64" w:name="_Toc232347090"/>
+      <w:bookmarkStart w:id="67" w:name="_Toc232353231"/>
       <w:r>
         <w:t xml:space="preserve">Figure </w:t>
       </w:r>
@@ -11590,7 +11926,7 @@
         <w:rPr>
           <w:noProof/>
         </w:rPr>
-        <w:t>23</w:t>
+        <w:t>25</w:t>
       </w:r>
       <w:r>
         <w:fldChar w:fldCharType="end"/>
@@ -11604,7 +11940,7 @@
       <w:r>
         <w:t>2</w:t>
       </w:r>
-      <w:bookmarkEnd w:id="64"/>
+      <w:bookmarkEnd w:id="67"/>
     </w:p>
     <w:p/>
     <w:p>
@@ -11613,6 +11949,9 @@
         <w:jc w:val="center"/>
       </w:pPr>
       <w:r>
+        <w:rPr>
+          <w:noProof/>
+        </w:rPr>
         <w:lastRenderedPageBreak/>
         <w:drawing>
           <wp:inline distT="0" distB="0" distL="0" distR="0" wp14:anchorId="3CCF97B8" wp14:editId="0FDFCC4A">
@@ -11630,7 +11969,7 @@
                     <pic:cNvPicPr/>
                   </pic:nvPicPr>
                   <pic:blipFill>
-                    <a:blip r:embed="rId32"/>
+                    <a:blip r:embed="rId34"/>
                     <a:stretch>
                       <a:fillRect/>
                     </a:stretch>
@@ -11662,7 +12001,7 @@
       <w:pPr>
         <w:pStyle w:val="Lgende"/>
       </w:pPr>
-      <w:bookmarkStart w:id="65" w:name="_Toc232347091"/>
+      <w:bookmarkStart w:id="68" w:name="_Toc232353232"/>
       <w:r>
         <w:t xml:space="preserve">Figure </w:t>
       </w:r>
@@ -11679,7 +12018,7 @@
         <w:rPr>
           <w:noProof/>
         </w:rPr>
-        <w:t>24</w:t>
+        <w:t>26</w:t>
       </w:r>
       <w:r>
         <w:fldChar w:fldCharType="end"/>
@@ -11687,7 +12026,7 @@
       <w:r>
         <w:t xml:space="preserve"> : Preuve de fonctionnement numéro 3</w:t>
       </w:r>
-      <w:bookmarkEnd w:id="65"/>
+      <w:bookmarkEnd w:id="68"/>
     </w:p>
     <w:p>
       <w:pPr>
@@ -11717,7 +12056,6 @@
           <w:u w:val="single"/>
         </w:rPr>
       </w:pPr>
-      <w:bookmarkStart w:id="66" w:name="_Toc232347066"/>
       <w:r>
         <w:rPr>
           <w:rFonts w:eastAsia="Times New Roman"/>
@@ -11736,6 +12074,7 @@
           <w:rFonts w:eastAsia="Times New Roman"/>
         </w:rPr>
       </w:pPr>
+      <w:bookmarkStart w:id="69" w:name="_Toc232353205"/>
       <w:r>
         <w:rPr>
           <w:rFonts w:eastAsia="Times New Roman"/>
@@ -11743,7 +12082,7 @@
         <w:lastRenderedPageBreak/>
         <w:t>Annexe</w:t>
       </w:r>
-      <w:bookmarkEnd w:id="66"/>
+      <w:bookmarkEnd w:id="69"/>
     </w:p>
     <w:p>
       <w:r>
@@ -11777,7 +12116,7 @@
                     <pic:cNvPicPr/>
                   </pic:nvPicPr>
                   <pic:blipFill>
-                    <a:blip r:embed="rId33"/>
+                    <a:blip r:embed="rId35"/>
                     <a:stretch>
                       <a:fillRect/>
                     </a:stretch>
@@ -11829,7 +12168,7 @@
           <w:rFonts w:eastAsiaTheme="minorHAnsi"/>
         </w:rPr>
       </w:pPr>
-      <w:bookmarkStart w:id="67" w:name="_Toc232347067"/>
+      <w:bookmarkStart w:id="70" w:name="_Toc232353206"/>
       <w:r>
         <w:rPr>
           <w:rFonts w:eastAsia="Times New Roman"/>
@@ -11837,7 +12176,7 @@
         <w:lastRenderedPageBreak/>
         <w:t>Tables des figures</w:t>
       </w:r>
-      <w:bookmarkEnd w:id="67"/>
+      <w:bookmarkEnd w:id="70"/>
     </w:p>
     <w:p>
       <w:pPr>
@@ -11878,7 +12217,7 @@
         </w:rPr>
         <w:fldChar w:fldCharType="separate"/>
       </w:r>
-      <w:hyperlink w:anchor="_Toc232347068" w:history="1">
+      <w:hyperlink w:anchor="_Toc232353207" w:history="1">
         <w:r>
           <w:rPr>
             <w:rStyle w:val="Lienhypertexte"/>
@@ -11905,7 +12244,7 @@
             <w:noProof/>
             <w:webHidden/>
           </w:rPr>
-          <w:instrText xml:space="preserve"> PAGEREF _Toc232347068 \h </w:instrText>
+          <w:instrText xml:space="preserve"> PAGEREF _Toc232353207 \h </w:instrText>
         </w:r>
         <w:r>
           <w:rPr>
@@ -11948,7 +12287,7 @@
           <w:sz w:val="24"/>
         </w:rPr>
       </w:pPr>
-      <w:hyperlink w:anchor="_Toc232347069" w:history="1">
+      <w:hyperlink w:anchor="_Toc232353208" w:history="1">
         <w:r>
           <w:rPr>
             <w:rStyle w:val="Lienhypertexte"/>
@@ -11975,7 +12314,7 @@
             <w:noProof/>
             <w:webHidden/>
           </w:rPr>
-          <w:instrText xml:space="preserve"> PAGEREF _Toc232347069 \h </w:instrText>
+          <w:instrText xml:space="preserve"> PAGEREF _Toc232353208 \h </w:instrText>
         </w:r>
         <w:r>
           <w:rPr>
@@ -12018,7 +12357,7 @@
           <w:sz w:val="24"/>
         </w:rPr>
       </w:pPr>
-      <w:hyperlink w:anchor="_Toc232347070" w:history="1">
+      <w:hyperlink w:anchor="_Toc232353209" w:history="1">
         <w:r>
           <w:rPr>
             <w:rStyle w:val="Lienhypertexte"/>
@@ -12045,7 +12384,7 @@
             <w:noProof/>
             <w:webHidden/>
           </w:rPr>
-          <w:instrText xml:space="preserve"> PAGEREF _Toc232347070 \h </w:instrText>
+          <w:instrText xml:space="preserve"> PAGEREF _Toc232353209 \h </w:instrText>
         </w:r>
         <w:r>
           <w:rPr>
@@ -12088,7 +12427,7 @@
           <w:sz w:val="24"/>
         </w:rPr>
       </w:pPr>
-      <w:hyperlink w:anchor="_Toc232347071" w:history="1">
+      <w:hyperlink w:anchor="_Toc232353210" w:history="1">
         <w:r>
           <w:rPr>
             <w:rStyle w:val="Lienhypertexte"/>
@@ -12115,7 +12454,7 @@
             <w:noProof/>
             <w:webHidden/>
           </w:rPr>
-          <w:instrText xml:space="preserve"> PAGEREF _Toc232347071 \h </w:instrText>
+          <w:instrText xml:space="preserve"> PAGEREF _Toc232353210 \h </w:instrText>
         </w:r>
         <w:r>
           <w:rPr>
@@ -12158,7 +12497,7 @@
           <w:sz w:val="24"/>
         </w:rPr>
       </w:pPr>
-      <w:hyperlink w:anchor="_Toc232347072" w:history="1">
+      <w:hyperlink w:anchor="_Toc232353211" w:history="1">
         <w:r>
           <w:rPr>
             <w:rStyle w:val="Lienhypertexte"/>
@@ -12185,7 +12524,7 @@
             <w:noProof/>
             <w:webHidden/>
           </w:rPr>
-          <w:instrText xml:space="preserve"> PAGEREF _Toc232347072 \h </w:instrText>
+          <w:instrText xml:space="preserve"> PAGEREF _Toc232353211 \h </w:instrText>
         </w:r>
         <w:r>
           <w:rPr>
@@ -12228,7 +12567,7 @@
           <w:sz w:val="24"/>
         </w:rPr>
       </w:pPr>
-      <w:hyperlink w:anchor="_Toc232347073" w:history="1">
+      <w:hyperlink w:anchor="_Toc232353212" w:history="1">
         <w:r>
           <w:rPr>
             <w:rStyle w:val="Lienhypertexte"/>
@@ -12255,7 +12594,7 @@
             <w:noProof/>
             <w:webHidden/>
           </w:rPr>
-          <w:instrText xml:space="preserve"> PAGEREF _Toc232347073 \h </w:instrText>
+          <w:instrText xml:space="preserve"> PAGEREF _Toc232353212 \h </w:instrText>
         </w:r>
         <w:r>
           <w:rPr>
@@ -12298,7 +12637,7 @@
           <w:sz w:val="24"/>
         </w:rPr>
       </w:pPr>
-      <w:hyperlink w:anchor="_Toc232347074" w:history="1">
+      <w:hyperlink w:anchor="_Toc232353213" w:history="1">
         <w:r>
           <w:rPr>
             <w:rStyle w:val="Lienhypertexte"/>
@@ -12325,7 +12664,7 @@
             <w:noProof/>
             <w:webHidden/>
           </w:rPr>
-          <w:instrText xml:space="preserve"> PAGEREF _Toc232347074 \h </w:instrText>
+          <w:instrText xml:space="preserve"> PAGEREF _Toc232353213 \h </w:instrText>
         </w:r>
         <w:r>
           <w:rPr>
@@ -12368,7 +12707,7 @@
           <w:sz w:val="24"/>
         </w:rPr>
       </w:pPr>
-      <w:hyperlink w:anchor="_Toc232347075" w:history="1">
+      <w:hyperlink w:anchor="_Toc232353214" w:history="1">
         <w:r>
           <w:rPr>
             <w:rStyle w:val="Lienhypertexte"/>
@@ -12395,7 +12734,7 @@
             <w:noProof/>
             <w:webHidden/>
           </w:rPr>
-          <w:instrText xml:space="preserve"> PAGEREF _Toc232347075 \h </w:instrText>
+          <w:instrText xml:space="preserve"> PAGEREF _Toc232353214 \h </w:instrText>
         </w:r>
         <w:r>
           <w:rPr>
@@ -12438,7 +12777,7 @@
           <w:sz w:val="24"/>
         </w:rPr>
       </w:pPr>
-      <w:hyperlink w:anchor="_Toc232347076" w:history="1">
+      <w:hyperlink w:anchor="_Toc232353215" w:history="1">
         <w:r>
           <w:rPr>
             <w:rStyle w:val="Lienhypertexte"/>
@@ -12465,7 +12804,7 @@
             <w:noProof/>
             <w:webHidden/>
           </w:rPr>
-          <w:instrText xml:space="preserve"> PAGEREF _Toc232347076 \h </w:instrText>
+          <w:instrText xml:space="preserve"> PAGEREF _Toc232353215 \h </w:instrText>
         </w:r>
         <w:r>
           <w:rPr>
@@ -12508,7 +12847,7 @@
           <w:sz w:val="24"/>
         </w:rPr>
       </w:pPr>
-      <w:hyperlink w:anchor="_Toc232347077" w:history="1">
+      <w:hyperlink w:anchor="_Toc232353216" w:history="1">
         <w:r>
           <w:rPr>
             <w:rStyle w:val="Lienhypertexte"/>
@@ -12535,7 +12874,7 @@
             <w:noProof/>
             <w:webHidden/>
           </w:rPr>
-          <w:instrText xml:space="preserve"> PAGEREF _Toc232347077 \h </w:instrText>
+          <w:instrText xml:space="preserve"> PAGEREF _Toc232353216 \h </w:instrText>
         </w:r>
         <w:r>
           <w:rPr>
@@ -12578,7 +12917,7 @@
           <w:sz w:val="24"/>
         </w:rPr>
       </w:pPr>
-      <w:hyperlink w:anchor="_Toc232347078" w:history="1">
+      <w:hyperlink w:anchor="_Toc232353217" w:history="1">
         <w:r>
           <w:rPr>
             <w:rStyle w:val="Lienhypertexte"/>
@@ -12605,7 +12944,7 @@
             <w:noProof/>
             <w:webHidden/>
           </w:rPr>
-          <w:instrText xml:space="preserve"> PAGEREF _Toc232347078 \h </w:instrText>
+          <w:instrText xml:space="preserve"> PAGEREF _Toc232353217 \h </w:instrText>
         </w:r>
         <w:r>
           <w:rPr>
@@ -12648,7 +12987,7 @@
           <w:sz w:val="24"/>
         </w:rPr>
       </w:pPr>
-      <w:hyperlink w:anchor="_Toc232347079" w:history="1">
+      <w:hyperlink w:anchor="_Toc232353218" w:history="1">
         <w:r>
           <w:rPr>
             <w:rStyle w:val="Lienhypertexte"/>
@@ -12675,7 +13014,7 @@
             <w:noProof/>
             <w:webHidden/>
           </w:rPr>
-          <w:instrText xml:space="preserve"> PAGEREF _Toc232347079 \h </w:instrText>
+          <w:instrText xml:space="preserve"> PAGEREF _Toc232353218 \h </w:instrText>
         </w:r>
         <w:r>
           <w:rPr>
@@ -12718,7 +13057,7 @@
           <w:sz w:val="24"/>
         </w:rPr>
       </w:pPr>
-      <w:hyperlink w:anchor="_Toc232347080" w:history="1">
+      <w:hyperlink w:anchor="_Toc232353219" w:history="1">
         <w:r>
           <w:rPr>
             <w:rStyle w:val="Lienhypertexte"/>
@@ -12745,7 +13084,7 @@
             <w:noProof/>
             <w:webHidden/>
           </w:rPr>
-          <w:instrText xml:space="preserve"> PAGEREF _Toc232347080 \h </w:instrText>
+          <w:instrText xml:space="preserve"> PAGEREF _Toc232353219 \h </w:instrText>
         </w:r>
         <w:r>
           <w:rPr>
@@ -12788,7 +13127,7 @@
           <w:sz w:val="24"/>
         </w:rPr>
       </w:pPr>
-      <w:hyperlink w:anchor="_Toc232347081" w:history="1">
+      <w:hyperlink w:anchor="_Toc232353220" w:history="1">
         <w:r>
           <w:rPr>
             <w:rStyle w:val="Lienhypertexte"/>
@@ -12815,7 +13154,7 @@
             <w:noProof/>
             <w:webHidden/>
           </w:rPr>
-          <w:instrText xml:space="preserve"> PAGEREF _Toc232347081 \h </w:instrText>
+          <w:instrText xml:space="preserve"> PAGEREF _Toc232353220 \h </w:instrText>
         </w:r>
         <w:r>
           <w:rPr>
@@ -12858,13 +13197,13 @@
           <w:sz w:val="24"/>
         </w:rPr>
       </w:pPr>
-      <w:hyperlink w:anchor="_Toc232347082" w:history="1">
+      <w:hyperlink w:anchor="_Toc232353221" w:history="1">
         <w:r>
           <w:rPr>
             <w:rStyle w:val="Lienhypertexte"/>
             <w:noProof/>
           </w:rPr>
-          <w:t>Figure 15 : : Représentation graphique de l'Unité de Gestion d'Instruction</w:t>
+          <w:t>Figure 15 : Simulation du registre de commande 32 bits dans le datapath</w:t>
         </w:r>
         <w:r>
           <w:rPr>
@@ -12885,7 +13224,7 @@
             <w:noProof/>
             <w:webHidden/>
           </w:rPr>
-          <w:instrText xml:space="preserve"> PAGEREF _Toc232347082 \h </w:instrText>
+          <w:instrText xml:space="preserve"> PAGEREF _Toc232353221 \h </w:instrText>
         </w:r>
         <w:r>
           <w:rPr>
@@ -12928,13 +13267,13 @@
           <w:sz w:val="24"/>
         </w:rPr>
       </w:pPr>
-      <w:hyperlink w:anchor="_Toc232347083" w:history="1">
+      <w:hyperlink w:anchor="_Toc232353222" w:history="1">
         <w:r>
           <w:rPr>
             <w:rStyle w:val="Lienhypertexte"/>
             <w:noProof/>
           </w:rPr>
-          <w:t>Figure 16 : Résultat de la simulation de l'Unité de Gestion d'Instruction</w:t>
+          <w:t>Figure 16 : : Représentation graphique de l'Unité de Gestion d'Instruction</w:t>
         </w:r>
         <w:r>
           <w:rPr>
@@ -12955,7 +13294,7 @@
             <w:noProof/>
             <w:webHidden/>
           </w:rPr>
-          <w:instrText xml:space="preserve"> PAGEREF _Toc232347083 \h </w:instrText>
+          <w:instrText xml:space="preserve"> PAGEREF _Toc232353222 \h </w:instrText>
         </w:r>
         <w:r>
           <w:rPr>
@@ -12975,7 +13314,7 @@
             <w:noProof/>
             <w:webHidden/>
           </w:rPr>
-          <w:t>25</w:t>
+          <w:t>24</w:t>
         </w:r>
         <w:r>
           <w:rPr>
@@ -12998,13 +13337,13 @@
           <w:sz w:val="24"/>
         </w:rPr>
       </w:pPr>
-      <w:hyperlink w:anchor="_Toc232347084" w:history="1">
+      <w:hyperlink w:anchor="_Toc232353223" w:history="1">
         <w:r>
           <w:rPr>
             <w:rStyle w:val="Lienhypertexte"/>
             <w:noProof/>
           </w:rPr>
-          <w:t>Figure 17 : Représentation graphique du Décodeur</w:t>
+          <w:t>Figure 17 : Résultat de la simulation de l'Unité de Gestion d'Instruction</w:t>
         </w:r>
         <w:r>
           <w:rPr>
@@ -13025,7 +13364,7 @@
             <w:noProof/>
             <w:webHidden/>
           </w:rPr>
-          <w:instrText xml:space="preserve"> PAGEREF _Toc232347084 \h </w:instrText>
+          <w:instrText xml:space="preserve"> PAGEREF _Toc232353223 \h </w:instrText>
         </w:r>
         <w:r>
           <w:rPr>
@@ -13068,13 +13407,13 @@
           <w:sz w:val="24"/>
         </w:rPr>
       </w:pPr>
-      <w:hyperlink w:anchor="_Toc232347085" w:history="1">
+      <w:hyperlink w:anchor="_Toc232353224" w:history="1">
         <w:r>
           <w:rPr>
             <w:rStyle w:val="Lienhypertexte"/>
             <w:noProof/>
           </w:rPr>
-          <w:t>Figure 18 : Résultat de la simulation du Decodeur</w:t>
+          <w:t>Figure 18 : Représentation graphique du Décodeur</w:t>
         </w:r>
         <w:r>
           <w:rPr>
@@ -13095,7 +13434,7 @@
             <w:noProof/>
             <w:webHidden/>
           </w:rPr>
-          <w:instrText xml:space="preserve"> PAGEREF _Toc232347085 \h </w:instrText>
+          <w:instrText xml:space="preserve"> PAGEREF _Toc232353224 \h </w:instrText>
         </w:r>
         <w:r>
           <w:rPr>
@@ -13115,7 +13454,7 @@
             <w:noProof/>
             <w:webHidden/>
           </w:rPr>
-          <w:t>28</w:t>
+          <w:t>27</w:t>
         </w:r>
         <w:r>
           <w:rPr>
@@ -13138,13 +13477,13 @@
           <w:sz w:val="24"/>
         </w:rPr>
       </w:pPr>
-      <w:hyperlink w:anchor="_Toc232347086" w:history="1">
+      <w:hyperlink w:anchor="_Toc232353225" w:history="1">
         <w:r>
           <w:rPr>
             <w:rStyle w:val="Lienhypertexte"/>
             <w:noProof/>
           </w:rPr>
-          <w:t>Figure 19 : Programme exécuté par le processeur monocycle</w:t>
+          <w:t>Figure 19 : Valeur des commandes</w:t>
         </w:r>
         <w:r>
           <w:rPr>
@@ -13165,7 +13504,77 @@
             <w:noProof/>
             <w:webHidden/>
           </w:rPr>
-          <w:instrText xml:space="preserve"> PAGEREF _Toc232347086 \h </w:instrText>
+          <w:instrText xml:space="preserve"> PAGEREF _Toc232353225 \h </w:instrText>
+        </w:r>
+        <w:r>
+          <w:rPr>
+            <w:noProof/>
+            <w:webHidden/>
+          </w:rPr>
+        </w:r>
+        <w:r>
+          <w:rPr>
+            <w:noProof/>
+            <w:webHidden/>
+          </w:rPr>
+          <w:fldChar w:fldCharType="separate"/>
+        </w:r>
+        <w:r>
+          <w:rPr>
+            <w:noProof/>
+            <w:webHidden/>
+          </w:rPr>
+          <w:t>27</w:t>
+        </w:r>
+        <w:r>
+          <w:rPr>
+            <w:noProof/>
+            <w:webHidden/>
+          </w:rPr>
+          <w:fldChar w:fldCharType="end"/>
+        </w:r>
+      </w:hyperlink>
+    </w:p>
+    <w:p>
+      <w:pPr>
+        <w:pStyle w:val="Tabledesillustrations"/>
+        <w:tabs>
+          <w:tab w:val="right" w:leader="dot" w:pos="9062"/>
+        </w:tabs>
+        <w:rPr>
+          <w:rFonts w:asciiTheme="minorHAnsi" w:eastAsiaTheme="minorEastAsia" w:hAnsiTheme="minorHAnsi"/>
+          <w:noProof/>
+          <w:sz w:val="24"/>
+        </w:rPr>
+      </w:pPr>
+      <w:hyperlink w:anchor="_Toc232353226" w:history="1">
+        <w:r>
+          <w:rPr>
+            <w:rStyle w:val="Lienhypertexte"/>
+            <w:noProof/>
+          </w:rPr>
+          <w:t>Figure 20 : Résultat de la simulation du Decodeur</w:t>
+        </w:r>
+        <w:r>
+          <w:rPr>
+            <w:noProof/>
+            <w:webHidden/>
+          </w:rPr>
+          <w:tab/>
+        </w:r>
+        <w:r>
+          <w:rPr>
+            <w:noProof/>
+            <w:webHidden/>
+          </w:rPr>
+          <w:fldChar w:fldCharType="begin"/>
+        </w:r>
+        <w:r>
+          <w:rPr>
+            <w:noProof/>
+            <w:webHidden/>
+          </w:rPr>
+          <w:instrText xml:space="preserve"> PAGEREF _Toc232353226 \h </w:instrText>
         </w:r>
         <w:r>
           <w:rPr>
@@ -13208,13 +13617,13 @@
           <w:sz w:val="24"/>
         </w:rPr>
       </w:pPr>
-      <w:hyperlink w:anchor="_Toc232347087" w:history="1">
+      <w:hyperlink w:anchor="_Toc232353227" w:history="1">
         <w:r>
           <w:rPr>
             <w:rStyle w:val="Lienhypertexte"/>
             <w:noProof/>
           </w:rPr>
-          <w:t>Figure 20 : Résultat de la simulation du monocycle</w:t>
+          <w:t>Figure 21 : Programme exécuté par le processeur monocycle</w:t>
         </w:r>
         <w:r>
           <w:rPr>
@@ -13235,7 +13644,7 @@
             <w:noProof/>
             <w:webHidden/>
           </w:rPr>
-          <w:instrText xml:space="preserve"> PAGEREF _Toc232347087 \h </w:instrText>
+          <w:instrText xml:space="preserve"> PAGEREF _Toc232353227 \h </w:instrText>
         </w:r>
         <w:r>
           <w:rPr>
@@ -13255,7 +13664,7 @@
             <w:noProof/>
             <w:webHidden/>
           </w:rPr>
-          <w:t>31</w:t>
+          <w:t>30</w:t>
         </w:r>
         <w:r>
           <w:rPr>
@@ -13278,13 +13687,13 @@
           <w:sz w:val="24"/>
         </w:rPr>
       </w:pPr>
-      <w:hyperlink w:anchor="_Toc232347088" w:history="1">
+      <w:hyperlink w:anchor="_Toc232353228" w:history="1">
         <w:r>
           <w:rPr>
             <w:rStyle w:val="Lienhypertexte"/>
             <w:noProof/>
           </w:rPr>
-          <w:t>Figure 21 : Pin planner du monocycle</w:t>
+          <w:t>Figure 22 : Résultat de la simulation du monocycle</w:t>
         </w:r>
         <w:r>
           <w:rPr>
@@ -13305,7 +13714,7 @@
             <w:noProof/>
             <w:webHidden/>
           </w:rPr>
-          <w:instrText xml:space="preserve"> PAGEREF _Toc232347088 \h </w:instrText>
+          <w:instrText xml:space="preserve"> PAGEREF _Toc232353228 \h </w:instrText>
         </w:r>
         <w:r>
           <w:rPr>
@@ -13325,7 +13734,7 @@
             <w:noProof/>
             <w:webHidden/>
           </w:rPr>
-          <w:t>34</w:t>
+          <w:t>32</w:t>
         </w:r>
         <w:r>
           <w:rPr>
@@ -13348,13 +13757,13 @@
           <w:sz w:val="24"/>
         </w:rPr>
       </w:pPr>
-      <w:hyperlink w:anchor="_Toc232347089" w:history="1">
+      <w:hyperlink w:anchor="_Toc232353229" w:history="1">
         <w:r>
           <w:rPr>
             <w:rStyle w:val="Lienhypertexte"/>
             <w:noProof/>
           </w:rPr>
-          <w:t>Figure 22 : Preuve de fonctionnement numéro 1</w:t>
+          <w:t>Figure 23 : Pin planner du monocycle</w:t>
         </w:r>
         <w:r>
           <w:rPr>
@@ -13375,7 +13784,7 @@
             <w:noProof/>
             <w:webHidden/>
           </w:rPr>
-          <w:instrText xml:space="preserve"> PAGEREF _Toc232347089 \h </w:instrText>
+          <w:instrText xml:space="preserve"> PAGEREF _Toc232353229 \h </w:instrText>
         </w:r>
         <w:r>
           <w:rPr>
@@ -13418,13 +13827,13 @@
           <w:sz w:val="24"/>
         </w:rPr>
       </w:pPr>
-      <w:hyperlink w:anchor="_Toc232347090" w:history="1">
+      <w:hyperlink w:anchor="_Toc232353230" w:history="1">
         <w:r>
           <w:rPr>
             <w:rStyle w:val="Lienhypertexte"/>
             <w:noProof/>
           </w:rPr>
-          <w:t>Figure 23 : Preuve de fonctionnement numéro 2</w:t>
+          <w:t>Figure 24 : Preuve de fonctionnement numéro 1</w:t>
         </w:r>
         <w:r>
           <w:rPr>
@@ -13445,77 +13854,7 @@
             <w:noProof/>
             <w:webHidden/>
           </w:rPr>
-          <w:instrText xml:space="preserve"> PAGEREF _Toc232347090 \h </w:instrText>
-        </w:r>
-        <w:r>
-          <w:rPr>
-            <w:noProof/>
-            <w:webHidden/>
-          </w:rPr>
-        </w:r>
-        <w:r>
-          <w:rPr>
-            <w:noProof/>
-            <w:webHidden/>
-          </w:rPr>
-          <w:fldChar w:fldCharType="separate"/>
-        </w:r>
-        <w:r>
-          <w:rPr>
-            <w:noProof/>
-            <w:webHidden/>
-          </w:rPr>
-          <w:t>35</w:t>
-        </w:r>
-        <w:r>
-          <w:rPr>
-            <w:noProof/>
-            <w:webHidden/>
-          </w:rPr>
-          <w:fldChar w:fldCharType="end"/>
-        </w:r>
-      </w:hyperlink>
-    </w:p>
-    <w:p>
-      <w:pPr>
-        <w:pStyle w:val="Tabledesillustrations"/>
-        <w:tabs>
-          <w:tab w:val="right" w:leader="dot" w:pos="9062"/>
-        </w:tabs>
-        <w:rPr>
-          <w:rFonts w:asciiTheme="minorHAnsi" w:eastAsiaTheme="minorEastAsia" w:hAnsiTheme="minorHAnsi"/>
-          <w:noProof/>
-          <w:sz w:val="24"/>
-        </w:rPr>
-      </w:pPr>
-      <w:hyperlink w:anchor="_Toc232347091" w:history="1">
-        <w:r>
-          <w:rPr>
-            <w:rStyle w:val="Lienhypertexte"/>
-            <w:noProof/>
-          </w:rPr>
-          <w:t>Figure 24 : Preuve de fonctionnement numéro 3</w:t>
-        </w:r>
-        <w:r>
-          <w:rPr>
-            <w:noProof/>
-            <w:webHidden/>
-          </w:rPr>
-          <w:tab/>
-        </w:r>
-        <w:r>
-          <w:rPr>
-            <w:noProof/>
-            <w:webHidden/>
-          </w:rPr>
-          <w:fldChar w:fldCharType="begin"/>
-        </w:r>
-        <w:r>
-          <w:rPr>
-            <w:noProof/>
-            <w:webHidden/>
-          </w:rPr>
-          <w:instrText xml:space="preserve"> PAGEREF _Toc232347091 \h </w:instrText>
+          <w:instrText xml:space="preserve"> PAGEREF _Toc232353230 \h </w:instrText>
         </w:r>
         <w:r>
           <w:rPr>
@@ -13548,6 +13887,146 @@
     </w:p>
     <w:p>
       <w:pPr>
+        <w:pStyle w:val="Tabledesillustrations"/>
+        <w:tabs>
+          <w:tab w:val="right" w:leader="dot" w:pos="9062"/>
+        </w:tabs>
+        <w:rPr>
+          <w:rFonts w:asciiTheme="minorHAnsi" w:eastAsiaTheme="minorEastAsia" w:hAnsiTheme="minorHAnsi"/>
+          <w:noProof/>
+          <w:sz w:val="24"/>
+        </w:rPr>
+      </w:pPr>
+      <w:hyperlink w:anchor="_Toc232353231" w:history="1">
+        <w:r>
+          <w:rPr>
+            <w:rStyle w:val="Lienhypertexte"/>
+            <w:noProof/>
+          </w:rPr>
+          <w:t>Figure 25 : Preuve de fonctionnement numéro 2</w:t>
+        </w:r>
+        <w:r>
+          <w:rPr>
+            <w:noProof/>
+            <w:webHidden/>
+          </w:rPr>
+          <w:tab/>
+        </w:r>
+        <w:r>
+          <w:rPr>
+            <w:noProof/>
+            <w:webHidden/>
+          </w:rPr>
+          <w:fldChar w:fldCharType="begin"/>
+        </w:r>
+        <w:r>
+          <w:rPr>
+            <w:noProof/>
+            <w:webHidden/>
+          </w:rPr>
+          <w:instrText xml:space="preserve"> PAGEREF _Toc232353231 \h </w:instrText>
+        </w:r>
+        <w:r>
+          <w:rPr>
+            <w:noProof/>
+            <w:webHidden/>
+          </w:rPr>
+        </w:r>
+        <w:r>
+          <w:rPr>
+            <w:noProof/>
+            <w:webHidden/>
+          </w:rPr>
+          <w:fldChar w:fldCharType="separate"/>
+        </w:r>
+        <w:r>
+          <w:rPr>
+            <w:noProof/>
+            <w:webHidden/>
+          </w:rPr>
+          <w:t>36</w:t>
+        </w:r>
+        <w:r>
+          <w:rPr>
+            <w:noProof/>
+            <w:webHidden/>
+          </w:rPr>
+          <w:fldChar w:fldCharType="end"/>
+        </w:r>
+      </w:hyperlink>
+    </w:p>
+    <w:p>
+      <w:pPr>
+        <w:pStyle w:val="Tabledesillustrations"/>
+        <w:tabs>
+          <w:tab w:val="right" w:leader="dot" w:pos="9062"/>
+        </w:tabs>
+        <w:rPr>
+          <w:rFonts w:asciiTheme="minorHAnsi" w:eastAsiaTheme="minorEastAsia" w:hAnsiTheme="minorHAnsi"/>
+          <w:noProof/>
+          <w:sz w:val="24"/>
+        </w:rPr>
+      </w:pPr>
+      <w:hyperlink w:anchor="_Toc232353232" w:history="1">
+        <w:r>
+          <w:rPr>
+            <w:rStyle w:val="Lienhypertexte"/>
+            <w:noProof/>
+          </w:rPr>
+          <w:t>Figure 26 : Preuve de fonctionnement numéro 3</w:t>
+        </w:r>
+        <w:r>
+          <w:rPr>
+            <w:noProof/>
+            <w:webHidden/>
+          </w:rPr>
+          <w:tab/>
+        </w:r>
+        <w:r>
+          <w:rPr>
+            <w:noProof/>
+            <w:webHidden/>
+          </w:rPr>
+          <w:fldChar w:fldCharType="begin"/>
+        </w:r>
+        <w:r>
+          <w:rPr>
+            <w:noProof/>
+            <w:webHidden/>
+          </w:rPr>
+          <w:instrText xml:space="preserve"> PAGEREF _Toc232353232 \h </w:instrText>
+        </w:r>
+        <w:r>
+          <w:rPr>
+            <w:noProof/>
+            <w:webHidden/>
+          </w:rPr>
+        </w:r>
+        <w:r>
+          <w:rPr>
+            <w:noProof/>
+            <w:webHidden/>
+          </w:rPr>
+          <w:fldChar w:fldCharType="separate"/>
+        </w:r>
+        <w:r>
+          <w:rPr>
+            <w:noProof/>
+            <w:webHidden/>
+          </w:rPr>
+          <w:t>37</w:t>
+        </w:r>
+        <w:r>
+          <w:rPr>
+            <w:noProof/>
+            <w:webHidden/>
+          </w:rPr>
+          <w:fldChar w:fldCharType="end"/>
+        </w:r>
+      </w:hyperlink>
+    </w:p>
+    <w:p>
+      <w:pPr>
         <w:rPr>
           <w:rFonts w:ascii="Times New Roman" w:eastAsia="Times New Roman" w:hAnsi="Times New Roman" w:cs="Times New Roman"/>
           <w:kern w:val="0"/>
@@ -13571,9 +14050,9 @@
       </w:r>
     </w:p>
     <w:sectPr>
-      <w:headerReference w:type="default" r:id="rId34"/>
-      <w:footerReference w:type="default" r:id="rId35"/>
-      <w:headerReference w:type="first" r:id="rId36"/>
+      <w:headerReference w:type="default" r:id="rId36"/>
+      <w:footerReference w:type="default" r:id="rId37"/>
+      <w:headerReference w:type="first" r:id="rId38"/>
       <w:pgSz w:w="11906" w:h="16838"/>
       <w:pgMar w:top="1417" w:right="1417" w:bottom="1417" w:left="1417" w:header="708" w:footer="708" w:gutter="0"/>
       <w:cols w:space="708"/>
@@ -14025,7 +14504,7 @@
         <v:path o:extrusionok="f" gradientshapeok="t" o:connecttype="rect"/>
         <o:lock v:ext="edit" aspectratio="t"/>
       </v:shapetype>
-      <v:shape id="_x0000_i1240" type="#_x0000_t75" style="width:11.55pt;height:11.55pt" o:bullet="t">
+      <v:shape id="_x0000_i1047" type="#_x0000_t75" style="width:11.5pt;height:11.5pt" o:bullet="t">
         <v:imagedata r:id="rId1" o:title="msoEA91"/>
       </v:shape>
     </w:pict>
@@ -22334,7 +22813,7 @@
   <w:style w:type="paragraph" w:default="1" w:styleId="Normal">
     <w:name w:val="Normal"/>
     <w:qFormat/>
-    <w:rsid w:val="00CA474D"/>
+    <w:rsid w:val="005E2F7C"/>
     <w:pPr>
       <w:spacing w:line="360" w:lineRule="auto"/>
       <w:jc w:val="both"/>
@@ -22578,6 +23057,7 @@
   <w:style w:type="character" w:default="1" w:styleId="Policepardfaut">
     <w:name w:val="Default Paragraph Font"/>
     <w:uiPriority w:val="1"/>
+    <w:semiHidden/>
     <w:unhideWhenUsed/>
   </w:style>
   <w:style w:type="table" w:default="1" w:styleId="TableauNormal">

</xml_diff>